<commit_message>
docs: complete master project report and sub-docs with embedded screenshots, RMUTI logo, PDF and Word builds
</commit_message>
<xml_diff>
--- a/docs/00_PROJECT_INFO.docx
+++ b/docs/00_PROJECT_INFO.docx
@@ -12,7 +12,7 @@
           <w:rFonts w:ascii="Sarabun" w:hAnsi="Sarabun"/>
           <w:b/>
           <w:color w:val="0F172A"/>
-          <w:sz w:val="40"/>
+          <w:sz w:val="36"/>
         </w:rPr>
         <w:t>ข้อมูลโครงการ (Project Information)</w:t>
       </w:r>
@@ -27,7 +27,7 @@
           <w:rFonts w:ascii="Sarabun" w:hAnsi="Sarabun"/>
           <w:b/>
           <w:color w:val="1E3A8A"/>
-          <w:sz w:val="30"/>
+          <w:sz w:val="28"/>
         </w:rPr>
         <w:t>ข้อมูลกลุ่มและวิชา</w:t>
       </w:r>
@@ -124,7 +124,7 @@
           <w:rFonts w:ascii="Sarabun" w:hAnsi="Sarabun"/>
           <w:b/>
           <w:color w:val="1E3A8A"/>
-          <w:sz w:val="30"/>
+          <w:sz w:val="28"/>
         </w:rPr>
         <w:t>เครื่องมือและเทคโนโลยีที่ใช้ (Tech Stack)</w:t>
       </w:r>
@@ -207,7 +207,7 @@
           <w:rFonts w:ascii="Sarabun" w:hAnsi="Sarabun"/>
           <w:b/>
           <w:color w:val="1E3A8A"/>
-          <w:sz w:val="30"/>
+          <w:sz w:val="28"/>
         </w:rPr>
         <w:t>การแบ่งหน้าที่ความรับผิดชอบของสมาชิก (ตามข้อกำหนดข้อ 9 ในใบงาน)</w:t>
       </w:r>
@@ -602,7 +602,7 @@
           <w:rFonts w:ascii="Sarabun" w:hAnsi="Sarabun"/>
           <w:b/>
           <w:color w:val="1E3A8A"/>
-          <w:sz w:val="30"/>
+          <w:sz w:val="28"/>
         </w:rPr>
         <w:t>แนวทางการดำเนินงานตามคำแนะนำของใบงาน (3 เสาหลัก)</w:t>
       </w:r>
@@ -796,7 +796,7 @@
           <w:rFonts w:ascii="Sarabun" w:hAnsi="Sarabun"/>
           <w:b/>
           <w:color w:val="1E3A8A"/>
-          <w:sz w:val="30"/>
+          <w:sz w:val="28"/>
         </w:rPr>
         <w:t>ขั้นตอนการดำเนินงาน 6 ระยะและหลักฐานประกอบ (ตามข้อกำหนดข้อ 8 ในใบงาน)</w:t>
       </w:r>
@@ -1483,7 +1483,7 @@
           <w:rFonts w:ascii="Sarabun" w:hAnsi="Sarabun"/>
           <w:b/>
           <w:color w:val="1E3A8A"/>
-          <w:sz w:val="30"/>
+          <w:sz w:val="28"/>
         </w:rPr>
         <w:t>รายการเอกสารที่จัดทำครบถ้วนตามเกณฑ์</w:t>
       </w:r>

</xml_diff>

<commit_message>
docs: remove browser pdf header/footer and enforce TH Sarabun font across PDF and Word
</commit_message>
<xml_diff>
--- a/docs/00_PROJECT_INFO.docx
+++ b/docs/00_PROJECT_INFO.docx
@@ -5,14 +5,16 @@
     <w:p>
       <w:pPr>
         <w:pStyle w:val="Heading1"/>
-        <w:spacing w:before="280" w:after="160"/>
+        <w:spacing w:before="280" w:after="120"/>
       </w:pPr>
       <w:r>
         <w:rPr>
-          <w:rFonts w:ascii="Sarabun" w:hAnsi="Sarabun"/>
+          <w:rFonts w:ascii="TH Sarabun New" w:hAnsi="TH Sarabun New"/>
           <w:b/>
+          <w:i w:val="0"/>
           <w:color w:val="0F172A"/>
-          <w:sz w:val="36"/>
+          <w:sz w:val="40"/>
+          <w:rFonts w:ascii="TH Sarabun New" w:hAnsi="TH Sarabun New" w:cs="TH Sarabun New"/>
         </w:rPr>
         <w:t>ข้อมูลโครงการ (Project Information)</w:t>
       </w:r>
@@ -20,14 +22,16 @@
     <w:p>
       <w:pPr>
         <w:pStyle w:val="Heading2"/>
-        <w:spacing w:before="240" w:after="120"/>
+        <w:spacing w:before="240" w:after="80"/>
       </w:pPr>
       <w:r>
         <w:rPr>
-          <w:rFonts w:ascii="Sarabun" w:hAnsi="Sarabun"/>
+          <w:rFonts w:ascii="TH Sarabun New" w:hAnsi="TH Sarabun New"/>
           <w:b/>
+          <w:i w:val="0"/>
           <w:color w:val="1E3A8A"/>
-          <w:sz w:val="28"/>
+          <w:sz w:val="36"/>
+          <w:rFonts w:ascii="TH Sarabun New" w:hAnsi="TH Sarabun New" w:cs="TH Sarabun New"/>
         </w:rPr>
         <w:t>ข้อมูลกลุ่มและวิชา</w:t>
       </w:r>
@@ -35,13 +39,16 @@
     <w:p>
       <w:pPr>
         <w:pStyle w:val="ListBullet"/>
-        <w:spacing w:after="60" w:line="276" w:lineRule="auto"/>
+        <w:spacing w:after="40" w:line="276" w:lineRule="auto"/>
       </w:pPr>
       <w:r>
         <w:rPr>
-          <w:rFonts w:ascii="Sarabun" w:hAnsi="Sarabun"/>
+          <w:rFonts w:ascii="TH Sarabun New" w:hAnsi="TH Sarabun New"/>
+          <w:b w:val="0"/>
+          <w:i w:val="0"/>
           <w:color w:val="1E293B"/>
-          <w:sz w:val="21"/>
+          <w:sz w:val="32"/>
+          <w:rFonts w:ascii="TH Sarabun New" w:hAnsi="TH Sarabun New" w:cs="TH Sarabun New"/>
         </w:rPr>
         <w:t>รายวิชาและตอนเรียน: Database (Mini Project Database ร้านขาย E-Book)</w:t>
       </w:r>
@@ -49,13 +56,16 @@
     <w:p>
       <w:pPr>
         <w:pStyle w:val="ListBullet"/>
-        <w:spacing w:after="60" w:line="276" w:lineRule="auto"/>
+        <w:spacing w:after="40" w:line="276" w:lineRule="auto"/>
       </w:pPr>
       <w:r>
         <w:rPr>
-          <w:rFonts w:ascii="Sarabun" w:hAnsi="Sarabun"/>
+          <w:rFonts w:ascii="TH Sarabun New" w:hAnsi="TH Sarabun New"/>
+          <w:b w:val="0"/>
+          <w:i w:val="0"/>
           <w:color w:val="1E293B"/>
-          <w:sz w:val="21"/>
+          <w:sz w:val="32"/>
+          <w:rFonts w:ascii="TH Sarabun New" w:hAnsi="TH Sarabun New" w:cs="TH Sarabun New"/>
         </w:rPr>
         <w:t>ชื่อโครงงาน: EBOOK_ONLINE</w:t>
       </w:r>
@@ -63,13 +73,16 @@
     <w:p>
       <w:pPr>
         <w:pStyle w:val="ListBullet"/>
-        <w:spacing w:after="60" w:line="276" w:lineRule="auto"/>
+        <w:spacing w:after="40" w:line="276" w:lineRule="auto"/>
       </w:pPr>
       <w:r>
         <w:rPr>
-          <w:rFonts w:ascii="Sarabun" w:hAnsi="Sarabun"/>
+          <w:rFonts w:ascii="TH Sarabun New" w:hAnsi="TH Sarabun New"/>
+          <w:b w:val="0"/>
+          <w:i w:val="0"/>
           <w:color w:val="1E293B"/>
-          <w:sz w:val="21"/>
+          <w:sz w:val="32"/>
+          <w:rFonts w:ascii="TH Sarabun New" w:hAnsi="TH Sarabun New" w:cs="TH Sarabun New"/>
         </w:rPr>
         <w:t>สมาชิกกลุ่ม:</w:t>
       </w:r>
@@ -77,13 +90,16 @@
     <w:p>
       <w:pPr>
         <w:pStyle w:val="ListNumber"/>
-        <w:spacing w:after="60"/>
+        <w:spacing w:after="40"/>
       </w:pPr>
       <w:r>
         <w:rPr>
-          <w:rFonts w:ascii="Sarabun" w:hAnsi="Sarabun"/>
+          <w:rFonts w:ascii="TH Sarabun New" w:hAnsi="TH Sarabun New"/>
+          <w:b w:val="0"/>
+          <w:i w:val="0"/>
           <w:color w:val="1E293B"/>
-          <w:sz w:val="21"/>
+          <w:sz w:val="32"/>
+          <w:rFonts w:ascii="TH Sarabun New" w:hAnsi="TH Sarabun New" w:cs="TH Sarabun New"/>
         </w:rPr>
         <w:t>นายธนวัฒน์ นามเหง้า รหัสประจำตัว: `67332110293-4`</w:t>
       </w:r>
@@ -91,25 +107,28 @@
     <w:p>
       <w:pPr>
         <w:pStyle w:val="ListNumber"/>
-        <w:spacing w:after="60"/>
+        <w:spacing w:after="40"/>
       </w:pPr>
       <w:r>
         <w:rPr>
-          <w:rFonts w:ascii="Sarabun" w:hAnsi="Sarabun"/>
+          <w:rFonts w:ascii="TH Sarabun New" w:hAnsi="TH Sarabun New"/>
+          <w:b w:val="0"/>
+          <w:i w:val="0"/>
           <w:color w:val="1E293B"/>
-          <w:sz w:val="21"/>
+          <w:sz w:val="32"/>
+          <w:rFonts w:ascii="TH Sarabun New" w:hAnsi="TH Sarabun New" w:cs="TH Sarabun New"/>
         </w:rPr>
         <w:t>นายภานุวัฒน์ แสงเครือ รหัสประจำตัว: `67332110248-5`</w:t>
       </w:r>
     </w:p>
     <w:p>
       <w:pPr>
-        <w:spacing w:before="120" w:after="120"/>
+        <w:spacing w:before="80" w:after="80"/>
       </w:pPr>
       <w:r>
         <w:rPr>
           <w:color w:val="CBD5E1"/>
-          <w:sz w:val="18"/>
+          <w:sz w:val="16"/>
         </w:rPr>
         <w:t>__________________________________________________________________________</w:t>
       </w:r>
@@ -117,14 +136,16 @@
     <w:p>
       <w:pPr>
         <w:pStyle w:val="Heading2"/>
-        <w:spacing w:before="240" w:after="120"/>
+        <w:spacing w:before="240" w:after="80"/>
       </w:pPr>
       <w:r>
         <w:rPr>
-          <w:rFonts w:ascii="Sarabun" w:hAnsi="Sarabun"/>
+          <w:rFonts w:ascii="TH Sarabun New" w:hAnsi="TH Sarabun New"/>
           <w:b/>
+          <w:i w:val="0"/>
           <w:color w:val="1E3A8A"/>
-          <w:sz w:val="28"/>
+          <w:sz w:val="36"/>
+          <w:rFonts w:ascii="TH Sarabun New" w:hAnsi="TH Sarabun New" w:cs="TH Sarabun New"/>
         </w:rPr>
         <w:t>เครื่องมือและเทคโนโลยีที่ใช้ (Tech Stack)</w:t>
       </w:r>
@@ -132,13 +153,16 @@
     <w:p>
       <w:pPr>
         <w:pStyle w:val="ListBullet"/>
-        <w:spacing w:after="60" w:line="276" w:lineRule="auto"/>
+        <w:spacing w:after="40" w:line="276" w:lineRule="auto"/>
       </w:pPr>
       <w:r>
         <w:rPr>
-          <w:rFonts w:ascii="Sarabun" w:hAnsi="Sarabun"/>
+          <w:rFonts w:ascii="TH Sarabun New" w:hAnsi="TH Sarabun New"/>
+          <w:b w:val="0"/>
+          <w:i w:val="0"/>
           <w:color w:val="1E293B"/>
-          <w:sz w:val="21"/>
+          <w:sz w:val="32"/>
+          <w:rFonts w:ascii="TH Sarabun New" w:hAnsi="TH Sarabun New" w:cs="TH Sarabun New"/>
         </w:rPr>
         <w:t>ภาษาหลัก: JavaScript (Node.js ES Modules / Express) + HTML5 / Vanilla CSS</w:t>
       </w:r>
@@ -146,13 +170,16 @@
     <w:p>
       <w:pPr>
         <w:pStyle w:val="ListBullet"/>
-        <w:spacing w:after="60" w:line="276" w:lineRule="auto"/>
+        <w:spacing w:after="40" w:line="276" w:lineRule="auto"/>
       </w:pPr>
       <w:r>
         <w:rPr>
-          <w:rFonts w:ascii="Sarabun" w:hAnsi="Sarabun"/>
+          <w:rFonts w:ascii="TH Sarabun New" w:hAnsi="TH Sarabun New"/>
+          <w:b w:val="0"/>
+          <w:i w:val="0"/>
           <w:color w:val="1E293B"/>
-          <w:sz w:val="21"/>
+          <w:sz w:val="32"/>
+          <w:rFonts w:ascii="TH Sarabun New" w:hAnsi="TH Sarabun New" w:cs="TH Sarabun New"/>
         </w:rPr>
         <w:t>Database Management System (DBMS): SQLite (ผ่านไดรเวอร์ `better-sqlite3` รองรับ ACID, Constraints, Foreign Keys และไฟล์ `.sql` มาตรฐาน)</w:t>
       </w:r>
@@ -160,13 +187,16 @@
     <w:p>
       <w:pPr>
         <w:pStyle w:val="ListBullet"/>
-        <w:spacing w:after="60" w:line="276" w:lineRule="auto"/>
+        <w:spacing w:after="40" w:line="276" w:lineRule="auto"/>
       </w:pPr>
       <w:r>
         <w:rPr>
-          <w:rFonts w:ascii="Sarabun" w:hAnsi="Sarabun"/>
+          <w:rFonts w:ascii="TH Sarabun New" w:hAnsi="TH Sarabun New"/>
+          <w:b w:val="0"/>
+          <w:i w:val="0"/>
           <w:color w:val="1E293B"/>
-          <w:sz w:val="21"/>
+          <w:sz w:val="32"/>
+          <w:rFonts w:ascii="TH Sarabun New" w:hAnsi="TH Sarabun New" w:cs="TH Sarabun New"/>
         </w:rPr>
         <w:t>เครื่องมือออกแบบ &amp; เอกสาร: Mermaid.js (สำหรับ ERD), Markdown Documentation</w:t>
       </w:r>
@@ -174,25 +204,28 @@
     <w:p>
       <w:pPr>
         <w:pStyle w:val="ListBullet"/>
-        <w:spacing w:after="60" w:line="276" w:lineRule="auto"/>
+        <w:spacing w:after="40" w:line="276" w:lineRule="auto"/>
       </w:pPr>
       <w:r>
         <w:rPr>
-          <w:rFonts w:ascii="Sarabun" w:hAnsi="Sarabun"/>
+          <w:rFonts w:ascii="TH Sarabun New" w:hAnsi="TH Sarabun New"/>
+          <w:b w:val="0"/>
+          <w:i w:val="0"/>
           <w:color w:val="1E293B"/>
-          <w:sz w:val="21"/>
+          <w:sz w:val="32"/>
+          <w:rFonts w:ascii="TH Sarabun New" w:hAnsi="TH Sarabun New" w:cs="TH Sarabun New"/>
         </w:rPr>
         <w:t>เครื่องมือ AI Assistant: Google DeepMind Antigravity AI (บันทึกขั้นตอนการให้คำปรึกษาและตรวจสอบความถูกต้องอย่างรับผิดชอบ)</w:t>
       </w:r>
     </w:p>
     <w:p>
       <w:pPr>
-        <w:spacing w:before="120" w:after="120"/>
+        <w:spacing w:before="80" w:after="80"/>
       </w:pPr>
       <w:r>
         <w:rPr>
           <w:color w:val="CBD5E1"/>
-          <w:sz w:val="18"/>
+          <w:sz w:val="16"/>
         </w:rPr>
         <w:t>__________________________________________________________________________</w:t>
       </w:r>
@@ -200,14 +233,16 @@
     <w:p>
       <w:pPr>
         <w:pStyle w:val="Heading2"/>
-        <w:spacing w:before="240" w:after="120"/>
+        <w:spacing w:before="240" w:after="80"/>
       </w:pPr>
       <w:r>
         <w:rPr>
-          <w:rFonts w:ascii="Sarabun" w:hAnsi="Sarabun"/>
+          <w:rFonts w:ascii="TH Sarabun New" w:hAnsi="TH Sarabun New"/>
           <w:b/>
+          <w:i w:val="0"/>
           <w:color w:val="1E3A8A"/>
-          <w:sz w:val="28"/>
+          <w:sz w:val="36"/>
+          <w:rFonts w:ascii="TH Sarabun New" w:hAnsi="TH Sarabun New" w:cs="TH Sarabun New"/>
         </w:rPr>
         <w:t>การแบ่งหน้าที่ความรับผิดชอบของสมาชิก (ตามข้อกำหนดข้อ 9 ในใบงาน)</w:t>
       </w:r>
@@ -238,20 +273,22 @@
           <w:tcPr>
             <w:tcW w:type="dxa" w:w="1872"/>
             <w:tcMar>
-              <w:top w:w="120" w:type="dxa"/>
-              <w:bottom w:w="120" w:type="dxa"/>
-              <w:left w:w="150" w:type="dxa"/>
-              <w:right w:w="150" w:type="dxa"/>
+              <w:top w:w="100" w:type="dxa"/>
+              <w:bottom w:w="100" w:type="dxa"/>
+              <w:left w:w="130" w:type="dxa"/>
+              <w:right w:w="130" w:type="dxa"/>
             </w:tcMar>
             <w:shd w:fill="1E3A8A"/>
           </w:tcPr>
           <w:p>
             <w:r>
               <w:rPr>
-                <w:rFonts w:ascii="Sarabun" w:hAnsi="Sarabun"/>
+                <w:rFonts w:ascii="TH Sarabun New" w:hAnsi="TH Sarabun New"/>
                 <w:b/>
+                <w:i w:val="0"/>
                 <w:color w:val="FFFFFF"/>
-                <w:sz w:val="20"/>
+                <w:sz w:val="28"/>
+                <w:rFonts w:ascii="TH Sarabun New" w:hAnsi="TH Sarabun New" w:cs="TH Sarabun New"/>
               </w:rPr>
               <w:t>สมาชิก</w:t>
             </w:r>
@@ -261,20 +298,22 @@
           <w:tcPr>
             <w:tcW w:type="dxa" w:w="1872"/>
             <w:tcMar>
-              <w:top w:w="120" w:type="dxa"/>
-              <w:bottom w:w="120" w:type="dxa"/>
-              <w:left w:w="150" w:type="dxa"/>
-              <w:right w:w="150" w:type="dxa"/>
+              <w:top w:w="100" w:type="dxa"/>
+              <w:bottom w:w="100" w:type="dxa"/>
+              <w:left w:w="130" w:type="dxa"/>
+              <w:right w:w="130" w:type="dxa"/>
             </w:tcMar>
             <w:shd w:fill="1E3A8A"/>
           </w:tcPr>
           <w:p>
             <w:r>
               <w:rPr>
-                <w:rFonts w:ascii="Sarabun" w:hAnsi="Sarabun"/>
+                <w:rFonts w:ascii="TH Sarabun New" w:hAnsi="TH Sarabun New"/>
                 <w:b/>
+                <w:i w:val="0"/>
                 <w:color w:val="FFFFFF"/>
-                <w:sz w:val="20"/>
+                <w:sz w:val="28"/>
+                <w:rFonts w:ascii="TH Sarabun New" w:hAnsi="TH Sarabun New" w:cs="TH Sarabun New"/>
               </w:rPr>
               <w:t>หน้าที่หลัก</w:t>
             </w:r>
@@ -284,20 +323,22 @@
           <w:tcPr>
             <w:tcW w:type="dxa" w:w="1872"/>
             <w:tcMar>
-              <w:top w:w="120" w:type="dxa"/>
-              <w:bottom w:w="120" w:type="dxa"/>
-              <w:left w:w="150" w:type="dxa"/>
-              <w:right w:w="150" w:type="dxa"/>
+              <w:top w:w="100" w:type="dxa"/>
+              <w:bottom w:w="100" w:type="dxa"/>
+              <w:left w:w="130" w:type="dxa"/>
+              <w:right w:w="130" w:type="dxa"/>
             </w:tcMar>
             <w:shd w:fill="1E3A8A"/>
           </w:tcPr>
           <w:p>
             <w:r>
               <w:rPr>
-                <w:rFonts w:ascii="Sarabun" w:hAnsi="Sarabun"/>
+                <w:rFonts w:ascii="TH Sarabun New" w:hAnsi="TH Sarabun New"/>
                 <w:b/>
+                <w:i w:val="0"/>
                 <w:color w:val="FFFFFF"/>
-                <w:sz w:val="20"/>
+                <w:sz w:val="28"/>
+                <w:rFonts w:ascii="TH Sarabun New" w:hAnsi="TH Sarabun New" w:cs="TH Sarabun New"/>
               </w:rPr>
               <w:t>ตารางที่รับผิดชอบ</w:t>
             </w:r>
@@ -307,20 +348,22 @@
           <w:tcPr>
             <w:tcW w:type="dxa" w:w="1872"/>
             <w:tcMar>
-              <w:top w:w="120" w:type="dxa"/>
-              <w:bottom w:w="120" w:type="dxa"/>
-              <w:left w:w="150" w:type="dxa"/>
-              <w:right w:w="150" w:type="dxa"/>
+              <w:top w:w="100" w:type="dxa"/>
+              <w:bottom w:w="100" w:type="dxa"/>
+              <w:left w:w="130" w:type="dxa"/>
+              <w:right w:w="130" w:type="dxa"/>
             </w:tcMar>
             <w:shd w:fill="1E3A8A"/>
           </w:tcPr>
           <w:p>
             <w:r>
               <w:rPr>
-                <w:rFonts w:ascii="Sarabun" w:hAnsi="Sarabun"/>
+                <w:rFonts w:ascii="TH Sarabun New" w:hAnsi="TH Sarabun New"/>
                 <w:b/>
+                <w:i w:val="0"/>
                 <w:color w:val="FFFFFF"/>
-                <w:sz w:val="20"/>
+                <w:sz w:val="28"/>
+                <w:rFonts w:ascii="TH Sarabun New" w:hAnsi="TH Sarabun New" w:cs="TH Sarabun New"/>
               </w:rPr>
               <w:t>Query รายงานที่ต้องอธิบาย</w:t>
             </w:r>
@@ -330,20 +373,22 @@
           <w:tcPr>
             <w:tcW w:type="dxa" w:w="1872"/>
             <w:tcMar>
-              <w:top w:w="120" w:type="dxa"/>
-              <w:bottom w:w="120" w:type="dxa"/>
-              <w:left w:w="150" w:type="dxa"/>
-              <w:right w:w="150" w:type="dxa"/>
+              <w:top w:w="100" w:type="dxa"/>
+              <w:bottom w:w="100" w:type="dxa"/>
+              <w:left w:w="130" w:type="dxa"/>
+              <w:right w:w="130" w:type="dxa"/>
             </w:tcMar>
             <w:shd w:fill="1E3A8A"/>
           </w:tcPr>
           <w:p>
             <w:r>
               <w:rPr>
-                <w:rFonts w:ascii="Sarabun" w:hAnsi="Sarabun"/>
+                <w:rFonts w:ascii="TH Sarabun New" w:hAnsi="TH Sarabun New"/>
                 <w:b/>
+                <w:i w:val="0"/>
                 <w:color w:val="FFFFFF"/>
-                <w:sz w:val="20"/>
+                <w:sz w:val="28"/>
+                <w:rFonts w:ascii="TH Sarabun New" w:hAnsi="TH Sarabun New" w:cs="TH Sarabun New"/>
               </w:rPr>
               <w:t>เส้นทางหลักของระบบที่รับผิดชอบ</w:t>
             </w:r>
@@ -355,19 +400,22 @@
           <w:tcPr>
             <w:tcW w:type="dxa" w:w="1872"/>
             <w:tcMar>
-              <w:top w:w="120" w:type="dxa"/>
-              <w:bottom w:w="120" w:type="dxa"/>
-              <w:left w:w="150" w:type="dxa"/>
-              <w:right w:w="150" w:type="dxa"/>
+              <w:top w:w="100" w:type="dxa"/>
+              <w:bottom w:w="100" w:type="dxa"/>
+              <w:left w:w="130" w:type="dxa"/>
+              <w:right w:w="130" w:type="dxa"/>
             </w:tcMar>
             <w:shd w:fill="F8FAFC"/>
           </w:tcPr>
           <w:p>
             <w:r>
               <w:rPr>
-                <w:rFonts w:ascii="Sarabun" w:hAnsi="Sarabun"/>
+                <w:rFonts w:ascii="TH Sarabun New" w:hAnsi="TH Sarabun New"/>
+                <w:b w:val="0"/>
+                <w:i w:val="0"/>
                 <w:color w:val="1E293B"/>
-                <w:sz w:val="19"/>
+                <w:sz w:val="27"/>
+                <w:rFonts w:ascii="TH Sarabun New" w:hAnsi="TH Sarabun New" w:cs="TH Sarabun New"/>
               </w:rPr>
               <w:t>**1. นายธนวัฒน์ นามเหง้า** (67332110293-4)</w:t>
             </w:r>
@@ -377,19 +425,22 @@
           <w:tcPr>
             <w:tcW w:type="dxa" w:w="1872"/>
             <w:tcMar>
-              <w:top w:w="120" w:type="dxa"/>
-              <w:bottom w:w="120" w:type="dxa"/>
-              <w:left w:w="150" w:type="dxa"/>
-              <w:right w:w="150" w:type="dxa"/>
+              <w:top w:w="100" w:type="dxa"/>
+              <w:bottom w:w="100" w:type="dxa"/>
+              <w:left w:w="130" w:type="dxa"/>
+              <w:right w:w="130" w:type="dxa"/>
             </w:tcMar>
             <w:shd w:fill="F8FAFC"/>
           </w:tcPr>
           <w:p>
             <w:r>
               <w:rPr>
-                <w:rFonts w:ascii="Sarabun" w:hAnsi="Sarabun"/>
+                <w:rFonts w:ascii="TH Sarabun New" w:hAnsi="TH Sarabun New"/>
+                <w:b w:val="0"/>
+                <w:i w:val="0"/>
                 <w:color w:val="1E293B"/>
-                <w:sz w:val="19"/>
+                <w:sz w:val="27"/>
+                <w:rFonts w:ascii="TH Sarabun New" w:hAnsi="TH Sarabun New" w:cs="TH Sarabun New"/>
               </w:rPr>
               <w:t>ผู้ออกแบบแค็ตตาล็อกสินค้า, ตะกร้าสินค้า และระบบแจกจ่ายไฟล์ดาวน์โหลดที่ปลอดภัย</w:t>
             </w:r>
@@ -399,19 +450,22 @@
           <w:tcPr>
             <w:tcW w:type="dxa" w:w="1872"/>
             <w:tcMar>
-              <w:top w:w="120" w:type="dxa"/>
-              <w:bottom w:w="120" w:type="dxa"/>
-              <w:left w:w="150" w:type="dxa"/>
-              <w:right w:w="150" w:type="dxa"/>
+              <w:top w:w="100" w:type="dxa"/>
+              <w:bottom w:w="100" w:type="dxa"/>
+              <w:left w:w="130" w:type="dxa"/>
+              <w:right w:w="130" w:type="dxa"/>
             </w:tcMar>
             <w:shd w:fill="F8FAFC"/>
           </w:tcPr>
           <w:p>
             <w:r>
               <w:rPr>
-                <w:rFonts w:ascii="Sarabun" w:hAnsi="Sarabun"/>
+                <w:rFonts w:ascii="TH Sarabun New" w:hAnsi="TH Sarabun New"/>
+                <w:b w:val="0"/>
+                <w:i w:val="0"/>
                 <w:color w:val="1E293B"/>
-                <w:sz w:val="19"/>
+                <w:sz w:val="27"/>
+                <w:rFonts w:ascii="TH Sarabun New" w:hAnsi="TH Sarabun New" w:cs="TH Sarabun New"/>
               </w:rPr>
               <w:t>`ebooks`, `categories`, `authors`, `carts`, `cart_items`, `download_links`</w:t>
             </w:r>
@@ -421,19 +475,22 @@
           <w:tcPr>
             <w:tcW w:type="dxa" w:w="1872"/>
             <w:tcMar>
-              <w:top w:w="120" w:type="dxa"/>
-              <w:bottom w:w="120" w:type="dxa"/>
-              <w:left w:w="150" w:type="dxa"/>
-              <w:right w:w="150" w:type="dxa"/>
+              <w:top w:w="100" w:type="dxa"/>
+              <w:bottom w:w="100" w:type="dxa"/>
+              <w:left w:w="130" w:type="dxa"/>
+              <w:right w:w="130" w:type="dxa"/>
             </w:tcMar>
             <w:shd w:fill="F8FAFC"/>
           </w:tcPr>
           <w:p>
             <w:r>
               <w:rPr>
-                <w:rFonts w:ascii="Sarabun" w:hAnsi="Sarabun"/>
+                <w:rFonts w:ascii="TH Sarabun New" w:hAnsi="TH Sarabun New"/>
+                <w:b w:val="0"/>
+                <w:i w:val="0"/>
                 <w:color w:val="1E293B"/>
-                <w:sz w:val="19"/>
+                <w:sz w:val="27"/>
+                <w:rFonts w:ascii="TH Sarabun New" w:hAnsi="TH Sarabun New" w:cs="TH Sarabun New"/>
               </w:rPr>
               <w:t>**รายงานที่ 2:** E-Book ขายดีตามยอดขายและจำนวนเล่ม&lt;br&gt;**รายงานที่ 3:** ยอดขายตามหมวดหมู่สินค้า</w:t>
             </w:r>
@@ -443,19 +500,22 @@
           <w:tcPr>
             <w:tcW w:type="dxa" w:w="1872"/>
             <w:tcMar>
-              <w:top w:w="120" w:type="dxa"/>
-              <w:bottom w:w="120" w:type="dxa"/>
-              <w:left w:w="150" w:type="dxa"/>
-              <w:right w:w="150" w:type="dxa"/>
+              <w:top w:w="100" w:type="dxa"/>
+              <w:bottom w:w="100" w:type="dxa"/>
+              <w:left w:w="130" w:type="dxa"/>
+              <w:right w:w="130" w:type="dxa"/>
             </w:tcMar>
             <w:shd w:fill="F8FAFC"/>
           </w:tcPr>
           <w:p>
             <w:r>
               <w:rPr>
-                <w:rFonts w:ascii="Sarabun" w:hAnsi="Sarabun"/>
+                <w:rFonts w:ascii="TH Sarabun New" w:hAnsi="TH Sarabun New"/>
+                <w:b w:val="0"/>
+                <w:i w:val="0"/>
                 <w:color w:val="1E293B"/>
-                <w:sz w:val="19"/>
+                <w:sz w:val="27"/>
+                <w:rFonts w:ascii="TH Sarabun New" w:hAnsi="TH Sarabun New" w:cs="TH Sarabun New"/>
               </w:rPr>
               <w:t>หน้าร้าน (Storefront): ค้นหา/กรองหนังสือ, ตะกร้าสินค้า และเงื่อนไขการเข้าถึงลิงก์ดาวน์โหลดหลังได้รับยืนยัน</w:t>
             </w:r>
@@ -467,19 +527,22 @@
           <w:tcPr>
             <w:tcW w:type="dxa" w:w="1872"/>
             <w:tcMar>
-              <w:top w:w="120" w:type="dxa"/>
-              <w:bottom w:w="120" w:type="dxa"/>
-              <w:left w:w="150" w:type="dxa"/>
-              <w:right w:w="150" w:type="dxa"/>
+              <w:top w:w="100" w:type="dxa"/>
+              <w:bottom w:w="100" w:type="dxa"/>
+              <w:left w:w="130" w:type="dxa"/>
+              <w:right w:w="130" w:type="dxa"/>
             </w:tcMar>
             <w:shd w:fill="FFFFFF"/>
           </w:tcPr>
           <w:p>
             <w:r>
               <w:rPr>
-                <w:rFonts w:ascii="Sarabun" w:hAnsi="Sarabun"/>
+                <w:rFonts w:ascii="TH Sarabun New" w:hAnsi="TH Sarabun New"/>
+                <w:b w:val="0"/>
+                <w:i w:val="0"/>
                 <w:color w:val="1E293B"/>
-                <w:sz w:val="19"/>
+                <w:sz w:val="27"/>
+                <w:rFonts w:ascii="TH Sarabun New" w:hAnsi="TH Sarabun New" w:cs="TH Sarabun New"/>
               </w:rPr>
               <w:t>**2. นายภานุวัฒน์ แสงเครือ** (67332110248-5)</w:t>
             </w:r>
@@ -489,19 +552,22 @@
           <w:tcPr>
             <w:tcW w:type="dxa" w:w="1872"/>
             <w:tcMar>
-              <w:top w:w="120" w:type="dxa"/>
-              <w:bottom w:w="120" w:type="dxa"/>
-              <w:left w:w="150" w:type="dxa"/>
-              <w:right w:w="150" w:type="dxa"/>
+              <w:top w:w="100" w:type="dxa"/>
+              <w:bottom w:w="100" w:type="dxa"/>
+              <w:left w:w="130" w:type="dxa"/>
+              <w:right w:w="130" w:type="dxa"/>
             </w:tcMar>
             <w:shd w:fill="FFFFFF"/>
           </w:tcPr>
           <w:p>
             <w:r>
               <w:rPr>
-                <w:rFonts w:ascii="Sarabun" w:hAnsi="Sarabun"/>
+                <w:rFonts w:ascii="TH Sarabun New" w:hAnsi="TH Sarabun New"/>
+                <w:b w:val="0"/>
+                <w:i w:val="0"/>
                 <w:color w:val="1E293B"/>
-                <w:sz w:val="19"/>
+                <w:sz w:val="27"/>
+                <w:rFonts w:ascii="TH Sarabun New" w:hAnsi="TH Sarabun New" w:cs="TH Sarabun New"/>
               </w:rPr>
               <w:t>ผู้ออกแบบระบบสมาชิก, สิทธิ์เข้าถึง, ระบบคำสั่งซื้อ และระบบชำระเงินจำลอง</w:t>
             </w:r>
@@ -511,19 +577,22 @@
           <w:tcPr>
             <w:tcW w:type="dxa" w:w="1872"/>
             <w:tcMar>
-              <w:top w:w="120" w:type="dxa"/>
-              <w:bottom w:w="120" w:type="dxa"/>
-              <w:left w:w="150" w:type="dxa"/>
-              <w:right w:w="150" w:type="dxa"/>
+              <w:top w:w="100" w:type="dxa"/>
+              <w:bottom w:w="100" w:type="dxa"/>
+              <w:left w:w="130" w:type="dxa"/>
+              <w:right w:w="130" w:type="dxa"/>
             </w:tcMar>
             <w:shd w:fill="FFFFFF"/>
           </w:tcPr>
           <w:p>
             <w:r>
               <w:rPr>
-                <w:rFonts w:ascii="Sarabun" w:hAnsi="Sarabun"/>
+                <w:rFonts w:ascii="TH Sarabun New" w:hAnsi="TH Sarabun New"/>
+                <w:b w:val="0"/>
+                <w:i w:val="0"/>
                 <w:color w:val="1E293B"/>
-                <w:sz w:val="19"/>
+                <w:sz w:val="27"/>
+                <w:rFonts w:ascii="TH Sarabun New" w:hAnsi="TH Sarabun New" w:cs="TH Sarabun New"/>
               </w:rPr>
               <w:t>`users`, `roles`, `orders`, `order_items`, `payments`</w:t>
             </w:r>
@@ -533,19 +602,22 @@
           <w:tcPr>
             <w:tcW w:type="dxa" w:w="1872"/>
             <w:tcMar>
-              <w:top w:w="120" w:type="dxa"/>
-              <w:bottom w:w="120" w:type="dxa"/>
-              <w:left w:w="150" w:type="dxa"/>
-              <w:right w:w="150" w:type="dxa"/>
+              <w:top w:w="100" w:type="dxa"/>
+              <w:bottom w:w="100" w:type="dxa"/>
+              <w:left w:w="130" w:type="dxa"/>
+              <w:right w:w="130" w:type="dxa"/>
             </w:tcMar>
             <w:shd w:fill="FFFFFF"/>
           </w:tcPr>
           <w:p>
             <w:r>
               <w:rPr>
-                <w:rFonts w:ascii="Sarabun" w:hAnsi="Sarabun"/>
+                <w:rFonts w:ascii="TH Sarabun New" w:hAnsi="TH Sarabun New"/>
+                <w:b w:val="0"/>
+                <w:i w:val="0"/>
                 <w:color w:val="1E293B"/>
-                <w:sz w:val="19"/>
+                <w:sz w:val="27"/>
+                <w:rFonts w:ascii="TH Sarabun New" w:hAnsi="TH Sarabun New" w:cs="TH Sarabun New"/>
               </w:rPr>
               <w:t>**รายงานที่ 1:** ยอดขายตามช่วงเวลา (วัน/เดือน)&lt;br&gt;**รายงานที่ 4:** ลูกค้าชั้นดีและสถิติสถานะคำสั่งซื้อ</w:t>
             </w:r>
@@ -555,19 +627,22 @@
           <w:tcPr>
             <w:tcW w:type="dxa" w:w="1872"/>
             <w:tcMar>
-              <w:top w:w="120" w:type="dxa"/>
-              <w:bottom w:w="120" w:type="dxa"/>
-              <w:left w:w="150" w:type="dxa"/>
-              <w:right w:w="150" w:type="dxa"/>
+              <w:top w:w="100" w:type="dxa"/>
+              <w:bottom w:w="100" w:type="dxa"/>
+              <w:left w:w="130" w:type="dxa"/>
+              <w:right w:w="130" w:type="dxa"/>
             </w:tcMar>
             <w:shd w:fill="FFFFFF"/>
           </w:tcPr>
           <w:p>
             <w:r>
               <w:rPr>
-                <w:rFonts w:ascii="Sarabun" w:hAnsi="Sarabun"/>
+                <w:rFonts w:ascii="TH Sarabun New" w:hAnsi="TH Sarabun New"/>
+                <w:b w:val="0"/>
+                <w:i w:val="0"/>
                 <w:color w:val="1E293B"/>
-                <w:sz w:val="19"/>
+                <w:sz w:val="27"/>
+                <w:rFonts w:ascii="TH Sarabun New" w:hAnsi="TH Sarabun New" w:cs="TH Sarabun New"/>
               </w:rPr>
               <w:t>หลังบ้าน (Admin): ระบบล็อกอินแยกสิทธิ์, ตรวจสอบหลักฐานสลิปจำลอง, อนุมัติคำสั่งซื้อ และสรุปยอดขาย</w:t>
             </w:r>
@@ -577,17 +652,17 @@
     </w:tbl>
     <w:p>
       <w:pPr>
-        <w:spacing w:after="120"/>
+        <w:spacing w:after="80"/>
       </w:pPr>
     </w:p>
     <w:p>
       <w:pPr>
-        <w:spacing w:before="120" w:after="120"/>
+        <w:spacing w:before="80" w:after="80"/>
       </w:pPr>
       <w:r>
         <w:rPr>
           <w:color w:val="CBD5E1"/>
-          <w:sz w:val="18"/>
+          <w:sz w:val="16"/>
         </w:rPr>
         <w:t>__________________________________________________________________________</w:t>
       </w:r>
@@ -595,27 +670,32 @@
     <w:p>
       <w:pPr>
         <w:pStyle w:val="Heading2"/>
-        <w:spacing w:before="240" w:after="120"/>
+        <w:spacing w:before="240" w:after="80"/>
       </w:pPr>
       <w:r>
         <w:rPr>
-          <w:rFonts w:ascii="Sarabun" w:hAnsi="Sarabun"/>
+          <w:rFonts w:ascii="TH Sarabun New" w:hAnsi="TH Sarabun New"/>
           <w:b/>
+          <w:i w:val="0"/>
           <w:color w:val="1E3A8A"/>
-          <w:sz w:val="28"/>
+          <w:sz w:val="36"/>
+          <w:rFonts w:ascii="TH Sarabun New" w:hAnsi="TH Sarabun New" w:cs="TH Sarabun New"/>
         </w:rPr>
         <w:t>แนวทางการดำเนินงานตามคำแนะนำของใบงาน (3 เสาหลัก)</w:t>
       </w:r>
     </w:p>
     <w:p>
       <w:pPr>
-        <w:spacing w:after="120" w:line="300" w:lineRule="auto"/>
+        <w:spacing w:after="80" w:line="288" w:lineRule="auto"/>
       </w:pPr>
       <w:r>
         <w:rPr>
-          <w:rFonts w:ascii="Sarabun" w:hAnsi="Sarabun"/>
+          <w:rFonts w:ascii="TH Sarabun New" w:hAnsi="TH Sarabun New"/>
+          <w:b w:val="0"/>
+          <w:i w:val="0"/>
           <w:color w:val="1E293B"/>
-          <w:sz w:val="22"/>
+          <w:sz w:val="32"/>
+          <w:rFonts w:ascii="TH Sarabun New" w:hAnsi="TH Sarabun New" w:cs="TH Sarabun New"/>
         </w:rPr>
         <w:t>เพื่อให้การทำงานมีประสิทธิภาพและได้คะแนนสูงสุด กลุ่มของเรายึดหลักปฏิบัติตามคำแนะนำหน้า 1 ของใบงาน ดังนี้:</w:t>
       </w:r>
@@ -623,13 +703,16 @@
     <w:p>
       <w:pPr>
         <w:pStyle w:val="ListNumber"/>
-        <w:spacing w:after="60"/>
+        <w:spacing w:after="40"/>
       </w:pPr>
       <w:r>
         <w:rPr>
-          <w:rFonts w:ascii="Sarabun" w:hAnsi="Sarabun"/>
+          <w:rFonts w:ascii="TH Sarabun New" w:hAnsi="TH Sarabun New"/>
+          <w:b w:val="0"/>
+          <w:i w:val="0"/>
           <w:color w:val="1E293B"/>
-          <w:sz w:val="21"/>
+          <w:sz w:val="32"/>
+          <w:rFonts w:ascii="TH Sarabun New" w:hAnsi="TH Sarabun New" w:cs="TH Sarabun New"/>
         </w:rPr>
         <w:t>เลือกขอบเขตที่พัฒนาและสาธิตได้จริง (Scope &amp; Feasibility):</w:t>
       </w:r>
@@ -637,13 +720,16 @@
     <w:p>
       <w:pPr>
         <w:pStyle w:val="ListBullet"/>
-        <w:spacing w:after="60" w:line="276" w:lineRule="auto"/>
+        <w:spacing w:after="40" w:line="276" w:lineRule="auto"/>
       </w:pPr>
       <w:r>
         <w:rPr>
-          <w:rFonts w:ascii="Sarabun" w:hAnsi="Sarabun"/>
+          <w:rFonts w:ascii="TH Sarabun New" w:hAnsi="TH Sarabun New"/>
+          <w:b w:val="0"/>
+          <w:i w:val="0"/>
           <w:color w:val="1E293B"/>
-          <w:sz w:val="21"/>
+          <w:sz w:val="32"/>
+          <w:rFonts w:ascii="TH Sarabun New" w:hAnsi="TH Sarabun New" w:cs="TH Sarabun New"/>
         </w:rPr>
         <w:t>เน้น Flow หลักที่สมบูรณ์ 100%: ลูกค้าสมัคร/ล็อกอิน -&gt; ค้นหา/กรอง -&gt; ใส่ตะกร้า -&gt; กดสั่งซื้อ -&gt; แนบสลิปชำระเงินจำลอง -&gt; แอดมินตรวจสลิปและกดยืนยัน -&gt; ปลดล็อกลิงก์ดาวน์โหลด</w:t>
       </w:r>
@@ -651,13 +737,16 @@
     <w:p>
       <w:pPr>
         <w:pStyle w:val="ListBullet"/>
-        <w:spacing w:after="60" w:line="276" w:lineRule="auto"/>
+        <w:spacing w:after="40" w:line="276" w:lineRule="auto"/>
       </w:pPr>
       <w:r>
         <w:rPr>
-          <w:rFonts w:ascii="Sarabun" w:hAnsi="Sarabun"/>
+          <w:rFonts w:ascii="TH Sarabun New" w:hAnsi="TH Sarabun New"/>
+          <w:b w:val="0"/>
+          <w:i w:val="0"/>
           <w:color w:val="1E293B"/>
-          <w:sz w:val="21"/>
+          <w:sz w:val="32"/>
+          <w:rFonts w:ascii="TH Sarabun New" w:hAnsi="TH Sarabun New" w:cs="TH Sarabun New"/>
         </w:rPr>
         <w:t>งดทำระบบภายนอกที่ไม่บังคับ (เช่น Payment Gateway ตัดบัตรจริง, DRM เข้ารหัสซับซ้อน, ระบบส่งเมลจริง) ตามข้อ 7 เพื่อทุ่มเทเวลาให้กับการออกแบบฐานข้อมูล ความถูกต้องของข้อมูล และรายงานวิเคราะห์ SQL 4 เรื่อง</w:t>
       </w:r>
@@ -665,13 +754,16 @@
     <w:p>
       <w:pPr>
         <w:pStyle w:val="ListNumber"/>
-        <w:spacing w:after="60"/>
+        <w:spacing w:after="40"/>
       </w:pPr>
       <w:r>
         <w:rPr>
-          <w:rFonts w:ascii="Sarabun" w:hAnsi="Sarabun"/>
+          <w:rFonts w:ascii="TH Sarabun New" w:hAnsi="TH Sarabun New"/>
+          <w:b w:val="0"/>
+          <w:i w:val="0"/>
           <w:color w:val="1E293B"/>
-          <w:sz w:val="21"/>
+          <w:sz w:val="32"/>
+          <w:rFonts w:ascii="TH Sarabun New" w:hAnsi="TH Sarabun New" w:cs="TH Sarabun New"/>
         </w:rPr>
         <w:t>ใช้ข้อมูลตัวอย่างที่สมเหตุสมผล (Realistic Seed Data):</w:t>
       </w:r>
@@ -679,13 +771,16 @@
     <w:p>
       <w:pPr>
         <w:pStyle w:val="ListBullet"/>
-        <w:spacing w:after="60" w:line="276" w:lineRule="auto"/>
+        <w:spacing w:after="40" w:line="276" w:lineRule="auto"/>
       </w:pPr>
       <w:r>
         <w:rPr>
-          <w:rFonts w:ascii="Sarabun" w:hAnsi="Sarabun"/>
+          <w:rFonts w:ascii="TH Sarabun New" w:hAnsi="TH Sarabun New"/>
+          <w:b w:val="0"/>
+          <w:i w:val="0"/>
           <w:color w:val="1E293B"/>
-          <w:sz w:val="21"/>
+          <w:sz w:val="32"/>
+          <w:rFonts w:ascii="TH Sarabun New" w:hAnsi="TH Sarabun New" w:cs="TH Sarabun New"/>
         </w:rPr>
         <w:t>ข้อมูล E-Book ผู้แต่ง และหมวดหมู่ ใช้ข้อมูลที่สื่อความหมายจริง (หมวดเทคโนโลยี, ธุรกิจ, ภาษา, จิตวิทยา ฯลฯ) พร้อมภาพปกตัวอย่าง</w:t>
       </w:r>
@@ -693,13 +788,16 @@
     <w:p>
       <w:pPr>
         <w:pStyle w:val="ListBullet"/>
-        <w:spacing w:after="60" w:line="276" w:lineRule="auto"/>
+        <w:spacing w:after="40" w:line="276" w:lineRule="auto"/>
       </w:pPr>
       <w:r>
         <w:rPr>
-          <w:rFonts w:ascii="Sarabun" w:hAnsi="Sarabun"/>
+          <w:rFonts w:ascii="TH Sarabun New" w:hAnsi="TH Sarabun New"/>
+          <w:b w:val="0"/>
+          <w:i w:val="0"/>
           <w:color w:val="1E293B"/>
-          <w:sz w:val="21"/>
+          <w:sz w:val="32"/>
+          <w:rFonts w:ascii="TH Sarabun New" w:hAnsi="TH Sarabun New" w:cs="TH Sarabun New"/>
         </w:rPr>
         <w:t>บันทึกคำสั่งซื้อตัวอย่างจริงมากกว่า 30 คำสั่งซื้อ มีการกระจายวันเวลา สถานะ (`pending`, `confirmed`, `cancelled`) เพื่อให้การทำรายงานวิเคราะห์และ Dashboard ตอบคำถามทางสถิติได้อย่างน่าเชื่อถือ</w:t>
       </w:r>
@@ -707,13 +805,16 @@
     <w:p>
       <w:pPr>
         <w:pStyle w:val="ListNumber"/>
-        <w:spacing w:after="60"/>
+        <w:spacing w:after="40"/>
       </w:pPr>
       <w:r>
         <w:rPr>
-          <w:rFonts w:ascii="Sarabun" w:hAnsi="Sarabun"/>
+          <w:rFonts w:ascii="TH Sarabun New" w:hAnsi="TH Sarabun New"/>
+          <w:b w:val="0"/>
+          <w:i w:val="0"/>
           <w:color w:val="1E293B"/>
-          <w:sz w:val="21"/>
+          <w:sz w:val="32"/>
+          <w:rFonts w:ascii="TH Sarabun New" w:hAnsi="TH Sarabun New" w:cs="TH Sarabun New"/>
         </w:rPr>
         <w:t>เก็บหลักฐานการทำงานไว้สำหรับการนำเสนอ (Evidence Collection):</w:t>
       </w:r>
@@ -721,13 +822,16 @@
     <w:p>
       <w:pPr>
         <w:pStyle w:val="ListBullet"/>
-        <w:spacing w:after="60" w:line="276" w:lineRule="auto"/>
+        <w:spacing w:after="40" w:line="276" w:lineRule="auto"/>
       </w:pPr>
       <w:r>
         <w:rPr>
-          <w:rFonts w:ascii="Sarabun" w:hAnsi="Sarabun"/>
+          <w:rFonts w:ascii="TH Sarabun New" w:hAnsi="TH Sarabun New"/>
+          <w:b w:val="0"/>
+          <w:i w:val="0"/>
           <w:color w:val="1E293B"/>
-          <w:sz w:val="21"/>
+          <w:sz w:val="32"/>
+          <w:rFonts w:ascii="TH Sarabun New" w:hAnsi="TH Sarabun New" w:cs="TH Sarabun New"/>
         </w:rPr>
         <w:t>เตรียมไฟล์ SQL มาตรฐาน (`schema.sql`, `seed.sql`, `reports.sql`) ให้ตรวจรันได้อิสระ</w:t>
       </w:r>
@@ -735,13 +839,16 @@
     <w:p>
       <w:pPr>
         <w:pStyle w:val="ListBullet"/>
-        <w:spacing w:after="60" w:line="276" w:lineRule="auto"/>
+        <w:spacing w:after="40" w:line="276" w:lineRule="auto"/>
       </w:pPr>
       <w:r>
         <w:rPr>
-          <w:rFonts w:ascii="Sarabun" w:hAnsi="Sarabun"/>
+          <w:rFonts w:ascii="TH Sarabun New" w:hAnsi="TH Sarabun New"/>
+          <w:b w:val="0"/>
+          <w:i w:val="0"/>
           <w:color w:val="1E293B"/>
-          <w:sz w:val="21"/>
+          <w:sz w:val="32"/>
+          <w:rFonts w:ascii="TH Sarabun New" w:hAnsi="TH Sarabun New" w:cs="TH Sarabun New"/>
         </w:rPr>
         <w:t>จัดทำตาราง Test Cases 8 กรณีอย่างละเอียด (ครอบคลุมทั้งข้อมูลที่ถูกต้องและ Edge Cases)</w:t>
       </w:r>
@@ -749,13 +856,16 @@
     <w:p>
       <w:pPr>
         <w:pStyle w:val="ListBullet"/>
-        <w:spacing w:after="60" w:line="276" w:lineRule="auto"/>
+        <w:spacing w:after="40" w:line="276" w:lineRule="auto"/>
       </w:pPr>
       <w:r>
         <w:rPr>
-          <w:rFonts w:ascii="Sarabun" w:hAnsi="Sarabun"/>
+          <w:rFonts w:ascii="TH Sarabun New" w:hAnsi="TH Sarabun New"/>
+          <w:b w:val="0"/>
+          <w:i w:val="0"/>
           <w:color w:val="1E293B"/>
-          <w:sz w:val="21"/>
+          <w:sz w:val="32"/>
+          <w:rFonts w:ascii="TH Sarabun New" w:hAnsi="TH Sarabun New" w:cs="TH Sarabun New"/>
         </w:rPr>
         <w:t>บันทึกการใช้งาน AI อย่างโปร่งใสในเอกสาร [02_AI_USAGE_LOG.md](file:///c:/Users/next5/Desktop/EBOOK/docs/02_AI_USAGE_LOG.md)</w:t>
       </w:r>
@@ -763,25 +873,28 @@
     <w:p>
       <w:pPr>
         <w:pStyle w:val="ListBullet"/>
-        <w:spacing w:after="60" w:line="276" w:lineRule="auto"/>
+        <w:spacing w:after="40" w:line="276" w:lineRule="auto"/>
       </w:pPr>
       <w:r>
         <w:rPr>
-          <w:rFonts w:ascii="Sarabun" w:hAnsi="Sarabun"/>
+          <w:rFonts w:ascii="TH Sarabun New" w:hAnsi="TH Sarabun New"/>
+          <w:b w:val="0"/>
+          <w:i w:val="0"/>
           <w:color w:val="1E293B"/>
-          <w:sz w:val="21"/>
+          <w:sz w:val="32"/>
+          <w:rFonts w:ascii="TH Sarabun New" w:hAnsi="TH Sarabun New" w:cs="TH Sarabun New"/>
         </w:rPr>
         <w:t>จัดเตรียมบัญชีทดสอบทั้งฝั่งลูกค้าและผู้ดูแลระบบ พร้อมขั้นตอนสาธิตเป็นลำดับขั้นตอน</w:t>
       </w:r>
     </w:p>
     <w:p>
       <w:pPr>
-        <w:spacing w:before="120" w:after="120"/>
+        <w:spacing w:before="80" w:after="80"/>
       </w:pPr>
       <w:r>
         <w:rPr>
           <w:color w:val="CBD5E1"/>
-          <w:sz w:val="18"/>
+          <w:sz w:val="16"/>
         </w:rPr>
         <w:t>__________________________________________________________________________</w:t>
       </w:r>
@@ -789,14 +902,16 @@
     <w:p>
       <w:pPr>
         <w:pStyle w:val="Heading2"/>
-        <w:spacing w:before="240" w:after="120"/>
+        <w:spacing w:before="240" w:after="80"/>
       </w:pPr>
       <w:r>
         <w:rPr>
-          <w:rFonts w:ascii="Sarabun" w:hAnsi="Sarabun"/>
+          <w:rFonts w:ascii="TH Sarabun New" w:hAnsi="TH Sarabun New"/>
           <w:b/>
+          <w:i w:val="0"/>
           <w:color w:val="1E3A8A"/>
-          <w:sz w:val="28"/>
+          <w:sz w:val="36"/>
+          <w:rFonts w:ascii="TH Sarabun New" w:hAnsi="TH Sarabun New" w:cs="TH Sarabun New"/>
         </w:rPr>
         <w:t>ขั้นตอนการดำเนินงาน 6 ระยะและหลักฐานประกอบ (ตามข้อกำหนดข้อ 8 ในใบงาน)</w:t>
       </w:r>
@@ -826,20 +941,22 @@
           <w:tcPr>
             <w:tcW w:type="dxa" w:w="2340"/>
             <w:tcMar>
-              <w:top w:w="120" w:type="dxa"/>
-              <w:bottom w:w="120" w:type="dxa"/>
-              <w:left w:w="150" w:type="dxa"/>
-              <w:right w:w="150" w:type="dxa"/>
+              <w:top w:w="100" w:type="dxa"/>
+              <w:bottom w:w="100" w:type="dxa"/>
+              <w:left w:w="130" w:type="dxa"/>
+              <w:right w:w="130" w:type="dxa"/>
             </w:tcMar>
             <w:shd w:fill="1E3A8A"/>
           </w:tcPr>
           <w:p>
             <w:r>
               <w:rPr>
-                <w:rFonts w:ascii="Sarabun" w:hAnsi="Sarabun"/>
+                <w:rFonts w:ascii="TH Sarabun New" w:hAnsi="TH Sarabun New"/>
                 <w:b/>
+                <w:i w:val="0"/>
                 <w:color w:val="FFFFFF"/>
-                <w:sz w:val="20"/>
+                <w:sz w:val="28"/>
+                <w:rFonts w:ascii="TH Sarabun New" w:hAnsi="TH Sarabun New" w:cs="TH Sarabun New"/>
               </w:rPr>
               <w:t>ระยะที่</w:t>
             </w:r>
@@ -849,20 +966,22 @@
           <w:tcPr>
             <w:tcW w:type="dxa" w:w="2340"/>
             <w:tcMar>
-              <w:top w:w="120" w:type="dxa"/>
-              <w:bottom w:w="120" w:type="dxa"/>
-              <w:left w:w="150" w:type="dxa"/>
-              <w:right w:w="150" w:type="dxa"/>
+              <w:top w:w="100" w:type="dxa"/>
+              <w:bottom w:w="100" w:type="dxa"/>
+              <w:left w:w="130" w:type="dxa"/>
+              <w:right w:w="130" w:type="dxa"/>
             </w:tcMar>
             <w:shd w:fill="1E3A8A"/>
           </w:tcPr>
           <w:p>
             <w:r>
               <w:rPr>
-                <w:rFonts w:ascii="Sarabun" w:hAnsi="Sarabun"/>
+                <w:rFonts w:ascii="TH Sarabun New" w:hAnsi="TH Sarabun New"/>
                 <w:b/>
+                <w:i w:val="0"/>
                 <w:color w:val="FFFFFF"/>
-                <w:sz w:val="20"/>
+                <w:sz w:val="28"/>
+                <w:rFonts w:ascii="TH Sarabun New" w:hAnsi="TH Sarabun New" w:cs="TH Sarabun New"/>
               </w:rPr>
               <w:t>งานที่ควรทำตามเกณฑ์</w:t>
             </w:r>
@@ -872,20 +991,22 @@
           <w:tcPr>
             <w:tcW w:type="dxa" w:w="2340"/>
             <w:tcMar>
-              <w:top w:w="120" w:type="dxa"/>
-              <w:bottom w:w="120" w:type="dxa"/>
-              <w:left w:w="150" w:type="dxa"/>
-              <w:right w:w="150" w:type="dxa"/>
+              <w:top w:w="100" w:type="dxa"/>
+              <w:bottom w:w="100" w:type="dxa"/>
+              <w:left w:w="130" w:type="dxa"/>
+              <w:right w:w="130" w:type="dxa"/>
             </w:tcMar>
             <w:shd w:fill="1E3A8A"/>
           </w:tcPr>
           <w:p>
             <w:r>
               <w:rPr>
-                <w:rFonts w:ascii="Sarabun" w:hAnsi="Sarabun"/>
+                <w:rFonts w:ascii="TH Sarabun New" w:hAnsi="TH Sarabun New"/>
                 <w:b/>
+                <w:i w:val="0"/>
                 <w:color w:val="FFFFFF"/>
-                <w:sz w:val="20"/>
+                <w:sz w:val="28"/>
+                <w:rFonts w:ascii="TH Sarabun New" w:hAnsi="TH Sarabun New" w:cs="TH Sarabun New"/>
               </w:rPr>
               <w:t>สิ่งที่โครงงานทำจริง</w:t>
             </w:r>
@@ -895,20 +1016,22 @@
           <w:tcPr>
             <w:tcW w:type="dxa" w:w="2340"/>
             <w:tcMar>
-              <w:top w:w="120" w:type="dxa"/>
-              <w:bottom w:w="120" w:type="dxa"/>
-              <w:left w:w="150" w:type="dxa"/>
-              <w:right w:w="150" w:type="dxa"/>
+              <w:top w:w="100" w:type="dxa"/>
+              <w:bottom w:w="100" w:type="dxa"/>
+              <w:left w:w="130" w:type="dxa"/>
+              <w:right w:w="130" w:type="dxa"/>
             </w:tcMar>
             <w:shd w:fill="1E3A8A"/>
           </w:tcPr>
           <w:p>
             <w:r>
               <w:rPr>
-                <w:rFonts w:ascii="Sarabun" w:hAnsi="Sarabun"/>
+                <w:rFonts w:ascii="TH Sarabun New" w:hAnsi="TH Sarabun New"/>
                 <w:b/>
+                <w:i w:val="0"/>
                 <w:color w:val="FFFFFF"/>
-                <w:sz w:val="20"/>
+                <w:sz w:val="28"/>
+                <w:rFonts w:ascii="TH Sarabun New" w:hAnsi="TH Sarabun New" w:cs="TH Sarabun New"/>
               </w:rPr>
               <w:t>หลักฐานเชิงประจักษ์ (Evidence)</w:t>
             </w:r>
@@ -920,19 +1043,22 @@
           <w:tcPr>
             <w:tcW w:type="dxa" w:w="2340"/>
             <w:tcMar>
-              <w:top w:w="120" w:type="dxa"/>
-              <w:bottom w:w="120" w:type="dxa"/>
-              <w:left w:w="150" w:type="dxa"/>
-              <w:right w:w="150" w:type="dxa"/>
+              <w:top w:w="100" w:type="dxa"/>
+              <w:bottom w:w="100" w:type="dxa"/>
+              <w:left w:w="130" w:type="dxa"/>
+              <w:right w:w="130" w:type="dxa"/>
             </w:tcMar>
             <w:shd w:fill="F8FAFC"/>
           </w:tcPr>
           <w:p>
             <w:r>
               <w:rPr>
-                <w:rFonts w:ascii="Sarabun" w:hAnsi="Sarabun"/>
+                <w:rFonts w:ascii="TH Sarabun New" w:hAnsi="TH Sarabun New"/>
+                <w:b w:val="0"/>
+                <w:i w:val="0"/>
                 <w:color w:val="1E293B"/>
-                <w:sz w:val="19"/>
+                <w:sz w:val="27"/>
+                <w:rFonts w:ascii="TH Sarabun New" w:hAnsi="TH Sarabun New" w:cs="TH Sarabun New"/>
               </w:rPr>
               <w:t>**1 วิเคราะห์**</w:t>
             </w:r>
@@ -942,19 +1068,22 @@
           <w:tcPr>
             <w:tcW w:type="dxa" w:w="2340"/>
             <w:tcMar>
-              <w:top w:w="120" w:type="dxa"/>
-              <w:bottom w:w="120" w:type="dxa"/>
-              <w:left w:w="150" w:type="dxa"/>
-              <w:right w:w="150" w:type="dxa"/>
+              <w:top w:w="100" w:type="dxa"/>
+              <w:bottom w:w="100" w:type="dxa"/>
+              <w:left w:w="130" w:type="dxa"/>
+              <w:right w:w="130" w:type="dxa"/>
             </w:tcMar>
             <w:shd w:fill="F8FAFC"/>
           </w:tcPr>
           <w:p>
             <w:r>
               <w:rPr>
-                <w:rFonts w:ascii="Sarabun" w:hAnsi="Sarabun"/>
+                <w:rFonts w:ascii="TH Sarabun New" w:hAnsi="TH Sarabun New"/>
+                <w:b w:val="0"/>
+                <w:i w:val="0"/>
                 <w:color w:val="1E293B"/>
-                <w:sz w:val="19"/>
+                <w:sz w:val="27"/>
+                <w:rFonts w:ascii="TH Sarabun New" w:hAnsi="TH Sarabun New" w:cs="TH Sarabun New"/>
               </w:rPr>
               <w:t>กำหนดกลุ่มผู้ใช้ ขอบเขตการทำงาน และกติกาของลิงก์ดาวน์โหลด</w:t>
             </w:r>
@@ -964,19 +1093,22 @@
           <w:tcPr>
             <w:tcW w:type="dxa" w:w="2340"/>
             <w:tcMar>
-              <w:top w:w="120" w:type="dxa"/>
-              <w:bottom w:w="120" w:type="dxa"/>
-              <w:left w:w="150" w:type="dxa"/>
-              <w:right w:w="150" w:type="dxa"/>
+              <w:top w:w="100" w:type="dxa"/>
+              <w:bottom w:w="100" w:type="dxa"/>
+              <w:left w:w="130" w:type="dxa"/>
+              <w:right w:w="130" w:type="dxa"/>
             </w:tcMar>
             <w:shd w:fill="F8FAFC"/>
           </w:tcPr>
           <w:p>
             <w:r>
               <w:rPr>
-                <w:rFonts w:ascii="Sarabun" w:hAnsi="Sarabun"/>
+                <w:rFonts w:ascii="TH Sarabun New" w:hAnsi="TH Sarabun New"/>
+                <w:b w:val="0"/>
+                <w:i w:val="0"/>
                 <w:color w:val="1E293B"/>
-                <w:sz w:val="19"/>
+                <w:sz w:val="27"/>
+                <w:rFonts w:ascii="TH Sarabun New" w:hAnsi="TH Sarabun New" w:cs="TH Sarabun New"/>
               </w:rPr>
               <w:t>กำหนด 2 บทบาท (Customer, Admin), ขอบเขตหน้าร้าน-หลังบ้าน และกติกาความปลอดภัยล็อกลิงก์ 403 จนกว่า Admin จะอนุมัติ</w:t>
             </w:r>
@@ -986,19 +1118,22 @@
           <w:tcPr>
             <w:tcW w:type="dxa" w:w="2340"/>
             <w:tcMar>
-              <w:top w:w="120" w:type="dxa"/>
-              <w:bottom w:w="120" w:type="dxa"/>
-              <w:left w:w="150" w:type="dxa"/>
-              <w:right w:w="150" w:type="dxa"/>
+              <w:top w:w="100" w:type="dxa"/>
+              <w:bottom w:w="100" w:type="dxa"/>
+              <w:left w:w="130" w:type="dxa"/>
+              <w:right w:w="130" w:type="dxa"/>
             </w:tcMar>
             <w:shd w:fill="F8FAFC"/>
           </w:tcPr>
           <w:p>
             <w:r>
               <w:rPr>
-                <w:rFonts w:ascii="Sarabun" w:hAnsi="Sarabun"/>
+                <w:rFonts w:ascii="TH Sarabun New" w:hAnsi="TH Sarabun New"/>
+                <w:b w:val="0"/>
+                <w:i w:val="0"/>
                 <w:color w:val="1E293B"/>
-                <w:sz w:val="19"/>
+                <w:sz w:val="27"/>
+                <w:rFonts w:ascii="TH Sarabun New" w:hAnsi="TH Sarabun New" w:cs="TH Sarabun New"/>
               </w:rPr>
               <w:t>ข้อเสนอ 1 หน้าและแผนผัง Sequence &amp; State Flow ใน [03_SYSTEM_FLOW_AND_SCENARIOS.md](file:///c:/Users/next5/Desktop/EBOOK/docs/03_SYSTEM_FLOW_AND_SCENARIOS.md)</w:t>
             </w:r>
@@ -1010,19 +1145,22 @@
           <w:tcPr>
             <w:tcW w:type="dxa" w:w="2340"/>
             <w:tcMar>
-              <w:top w:w="120" w:type="dxa"/>
-              <w:bottom w:w="120" w:type="dxa"/>
-              <w:left w:w="150" w:type="dxa"/>
-              <w:right w:w="150" w:type="dxa"/>
+              <w:top w:w="100" w:type="dxa"/>
+              <w:bottom w:w="100" w:type="dxa"/>
+              <w:left w:w="130" w:type="dxa"/>
+              <w:right w:w="130" w:type="dxa"/>
             </w:tcMar>
             <w:shd w:fill="FFFFFF"/>
           </w:tcPr>
           <w:p>
             <w:r>
               <w:rPr>
-                <w:rFonts w:ascii="Sarabun" w:hAnsi="Sarabun"/>
+                <w:rFonts w:ascii="TH Sarabun New" w:hAnsi="TH Sarabun New"/>
+                <w:b w:val="0"/>
+                <w:i w:val="0"/>
                 <w:color w:val="1E293B"/>
-                <w:sz w:val="19"/>
+                <w:sz w:val="27"/>
+                <w:rFonts w:ascii="TH Sarabun New" w:hAnsi="TH Sarabun New" w:cs="TH Sarabun New"/>
               </w:rPr>
               <w:t>**2 ออกแบบ**</w:t>
             </w:r>
@@ -1032,19 +1170,22 @@
           <w:tcPr>
             <w:tcW w:type="dxa" w:w="2340"/>
             <w:tcMar>
-              <w:top w:w="120" w:type="dxa"/>
-              <w:bottom w:w="120" w:type="dxa"/>
-              <w:left w:w="150" w:type="dxa"/>
-              <w:right w:w="150" w:type="dxa"/>
+              <w:top w:w="100" w:type="dxa"/>
+              <w:bottom w:w="100" w:type="dxa"/>
+              <w:left w:w="130" w:type="dxa"/>
+              <w:right w:w="130" w:type="dxa"/>
             </w:tcMar>
             <w:shd w:fill="FFFFFF"/>
           </w:tcPr>
           <w:p>
             <w:r>
               <w:rPr>
-                <w:rFonts w:ascii="Sarabun" w:hAnsi="Sarabun"/>
+                <w:rFonts w:ascii="TH Sarabun New" w:hAnsi="TH Sarabun New"/>
+                <w:b w:val="0"/>
+                <w:i w:val="0"/>
                 <w:color w:val="1E293B"/>
-                <w:sz w:val="19"/>
+                <w:sz w:val="27"/>
+                <w:rFonts w:ascii="TH Sarabun New" w:hAnsi="TH Sarabun New" w:cs="TH Sarabun New"/>
               </w:rPr>
               <w:t>สร้าง ERD data dictionary และร่างหน้าจอที่จำเป็น</w:t>
             </w:r>
@@ -1054,19 +1195,22 @@
           <w:tcPr>
             <w:tcW w:type="dxa" w:w="2340"/>
             <w:tcMar>
-              <w:top w:w="120" w:type="dxa"/>
-              <w:bottom w:w="120" w:type="dxa"/>
-              <w:left w:w="150" w:type="dxa"/>
-              <w:right w:w="150" w:type="dxa"/>
+              <w:top w:w="100" w:type="dxa"/>
+              <w:bottom w:w="100" w:type="dxa"/>
+              <w:left w:w="130" w:type="dxa"/>
+              <w:right w:w="130" w:type="dxa"/>
             </w:tcMar>
             <w:shd w:fill="FFFFFF"/>
           </w:tcPr>
           <w:p>
             <w:r>
               <w:rPr>
-                <w:rFonts w:ascii="Sarabun" w:hAnsi="Sarabun"/>
+                <w:rFonts w:ascii="TH Sarabun New" w:hAnsi="TH Sarabun New"/>
+                <w:b w:val="0"/>
+                <w:i w:val="0"/>
                 <w:color w:val="1E293B"/>
-                <w:sz w:val="19"/>
+                <w:sz w:val="27"/>
+                <w:rFonts w:ascii="TH Sarabun New" w:hAnsi="TH Sarabun New" w:cs="TH Sarabun New"/>
               </w:rPr>
               <w:t>ออกแบบฐานข้อมูล 11 ตาราง (3NF), Data Dictionary ครบทุกฟิลด์ และออกแบบ UI หน้าร้านและหลังบ้าน</w:t>
             </w:r>
@@ -1076,19 +1220,22 @@
           <w:tcPr>
             <w:tcW w:type="dxa" w:w="2340"/>
             <w:tcMar>
-              <w:top w:w="120" w:type="dxa"/>
-              <w:bottom w:w="120" w:type="dxa"/>
-              <w:left w:w="150" w:type="dxa"/>
-              <w:right w:w="150" w:type="dxa"/>
+              <w:top w:w="100" w:type="dxa"/>
+              <w:bottom w:w="100" w:type="dxa"/>
+              <w:left w:w="130" w:type="dxa"/>
+              <w:right w:w="130" w:type="dxa"/>
             </w:tcMar>
             <w:shd w:fill="FFFFFF"/>
           </w:tcPr>
           <w:p>
             <w:r>
               <w:rPr>
-                <w:rFonts w:ascii="Sarabun" w:hAnsi="Sarabun"/>
+                <w:rFonts w:ascii="TH Sarabun New" w:hAnsi="TH Sarabun New"/>
+                <w:b w:val="0"/>
+                <w:i w:val="0"/>
                 <w:color w:val="1E293B"/>
-                <w:sz w:val="19"/>
+                <w:sz w:val="27"/>
+                <w:rFonts w:ascii="TH Sarabun New" w:hAnsi="TH Sarabun New" w:cs="TH Sarabun New"/>
               </w:rPr>
               <w:t>ERD, Data Dictionary ใน [01_DATABASE_DESIGN_ERD.md](file:///c:/Users/next5/Desktop/EBOOK/docs/01_DATABASE_DESIGN_ERD.md) และสถาปัตยกรรมหน้าจอ</w:t>
             </w:r>
@@ -1100,19 +1247,22 @@
           <w:tcPr>
             <w:tcW w:type="dxa" w:w="2340"/>
             <w:tcMar>
-              <w:top w:w="120" w:type="dxa"/>
-              <w:bottom w:w="120" w:type="dxa"/>
-              <w:left w:w="150" w:type="dxa"/>
-              <w:right w:w="150" w:type="dxa"/>
+              <w:top w:w="100" w:type="dxa"/>
+              <w:bottom w:w="100" w:type="dxa"/>
+              <w:left w:w="130" w:type="dxa"/>
+              <w:right w:w="130" w:type="dxa"/>
             </w:tcMar>
             <w:shd w:fill="F8FAFC"/>
           </w:tcPr>
           <w:p>
             <w:r>
               <w:rPr>
-                <w:rFonts w:ascii="Sarabun" w:hAnsi="Sarabun"/>
+                <w:rFonts w:ascii="TH Sarabun New" w:hAnsi="TH Sarabun New"/>
+                <w:b w:val="0"/>
+                <w:i w:val="0"/>
                 <w:color w:val="1E293B"/>
-                <w:sz w:val="19"/>
+                <w:sz w:val="27"/>
+                <w:rFonts w:ascii="TH Sarabun New" w:hAnsi="TH Sarabun New" w:cs="TH Sarabun New"/>
               </w:rPr>
               <w:t>**3 พัฒนา**</w:t>
             </w:r>
@@ -1122,19 +1272,22 @@
           <w:tcPr>
             <w:tcW w:type="dxa" w:w="2340"/>
             <w:tcMar>
-              <w:top w:w="120" w:type="dxa"/>
-              <w:bottom w:w="120" w:type="dxa"/>
-              <w:left w:w="150" w:type="dxa"/>
-              <w:right w:w="150" w:type="dxa"/>
+              <w:top w:w="100" w:type="dxa"/>
+              <w:bottom w:w="100" w:type="dxa"/>
+              <w:left w:w="130" w:type="dxa"/>
+              <w:right w:w="130" w:type="dxa"/>
             </w:tcMar>
             <w:shd w:fill="F8FAFC"/>
           </w:tcPr>
           <w:p>
             <w:r>
               <w:rPr>
-                <w:rFonts w:ascii="Sarabun" w:hAnsi="Sarabun"/>
+                <w:rFonts w:ascii="TH Sarabun New" w:hAnsi="TH Sarabun New"/>
+                <w:b w:val="0"/>
+                <w:i w:val="0"/>
                 <w:color w:val="1E293B"/>
-                <w:sz w:val="19"/>
+                <w:sz w:val="27"/>
+                <w:rFonts w:ascii="TH Sarabun New" w:hAnsi="TH Sarabun New" w:cs="TH Sarabun New"/>
               </w:rPr>
               <w:t>สร้างฐานข้อมูล ใส่ข้อมูลตัวอย่าง เชื่อมหน้าจอและส่วนหลังบ้าน</w:t>
             </w:r>
@@ -1144,19 +1297,22 @@
           <w:tcPr>
             <w:tcW w:type="dxa" w:w="2340"/>
             <w:tcMar>
-              <w:top w:w="120" w:type="dxa"/>
-              <w:bottom w:w="120" w:type="dxa"/>
-              <w:left w:w="150" w:type="dxa"/>
-              <w:right w:w="150" w:type="dxa"/>
+              <w:top w:w="100" w:type="dxa"/>
+              <w:bottom w:w="100" w:type="dxa"/>
+              <w:left w:w="130" w:type="dxa"/>
+              <w:right w:w="130" w:type="dxa"/>
             </w:tcMar>
             <w:shd w:fill="F8FAFC"/>
           </w:tcPr>
           <w:p>
             <w:r>
               <w:rPr>
-                <w:rFonts w:ascii="Sarabun" w:hAnsi="Sarabun"/>
+                <w:rFonts w:ascii="TH Sarabun New" w:hAnsi="TH Sarabun New"/>
+                <w:b w:val="0"/>
+                <w:i w:val="0"/>
                 <w:color w:val="1E293B"/>
-                <w:sz w:val="19"/>
+                <w:sz w:val="27"/>
+                <w:rFonts w:ascii="TH Sarabun New" w:hAnsi="TH Sarabun New" w:cs="TH Sarabun New"/>
               </w:rPr>
               <w:t>เขียน `schema.sql`, นำเข้า `seed.sql` (32 ออเดอร์, สลิปจำลอง 32 รูป), พัฒนา Express 5 API + Vanilla JS UI</w:t>
             </w:r>
@@ -1166,19 +1322,22 @@
           <w:tcPr>
             <w:tcW w:type="dxa" w:w="2340"/>
             <w:tcMar>
-              <w:top w:w="120" w:type="dxa"/>
-              <w:bottom w:w="120" w:type="dxa"/>
-              <w:left w:w="150" w:type="dxa"/>
-              <w:right w:w="150" w:type="dxa"/>
+              <w:top w:w="100" w:type="dxa"/>
+              <w:bottom w:w="100" w:type="dxa"/>
+              <w:left w:w="130" w:type="dxa"/>
+              <w:right w:w="130" w:type="dxa"/>
             </w:tcMar>
             <w:shd w:fill="F8FAFC"/>
           </w:tcPr>
           <w:p>
             <w:r>
               <w:rPr>
-                <w:rFonts w:ascii="Sarabun" w:hAnsi="Sarabun"/>
+                <w:rFonts w:ascii="TH Sarabun New" w:hAnsi="TH Sarabun New"/>
+                <w:b w:val="0"/>
+                <w:i w:val="0"/>
                 <w:color w:val="1E293B"/>
-                <w:sz w:val="19"/>
+                <w:sz w:val="27"/>
+                <w:rFonts w:ascii="TH Sarabun New" w:hAnsi="TH Sarabun New" w:cs="TH Sarabun New"/>
               </w:rPr>
               <w:t>Source Code และ SQL: [database/schema.sql](file:///c:/Users/next5/Desktop/EBOOK/database/schema.sql), [database/seed.sql](file:///c:/Users/next5/Desktop/EBOOK/database/seed.sql), [server.js](file:///c:/Users/next5/Desktop/EBOOK/server.js)</w:t>
             </w:r>
@@ -1190,19 +1349,22 @@
           <w:tcPr>
             <w:tcW w:type="dxa" w:w="2340"/>
             <w:tcMar>
-              <w:top w:w="120" w:type="dxa"/>
-              <w:bottom w:w="120" w:type="dxa"/>
-              <w:left w:w="150" w:type="dxa"/>
-              <w:right w:w="150" w:type="dxa"/>
+              <w:top w:w="100" w:type="dxa"/>
+              <w:bottom w:w="100" w:type="dxa"/>
+              <w:left w:w="130" w:type="dxa"/>
+              <w:right w:w="130" w:type="dxa"/>
             </w:tcMar>
             <w:shd w:fill="FFFFFF"/>
           </w:tcPr>
           <w:p>
             <w:r>
               <w:rPr>
-                <w:rFonts w:ascii="Sarabun" w:hAnsi="Sarabun"/>
+                <w:rFonts w:ascii="TH Sarabun New" w:hAnsi="TH Sarabun New"/>
+                <w:b w:val="0"/>
+                <w:i w:val="0"/>
                 <w:color w:val="1E293B"/>
-                <w:sz w:val="19"/>
+                <w:sz w:val="27"/>
+                <w:rFonts w:ascii="TH Sarabun New" w:hAnsi="TH Sarabun New" w:cs="TH Sarabun New"/>
               </w:rPr>
               <w:t>**4 ปรับปรุงแก้ไข**</w:t>
             </w:r>
@@ -1212,19 +1374,22 @@
           <w:tcPr>
             <w:tcW w:type="dxa" w:w="2340"/>
             <w:tcMar>
-              <w:top w:w="120" w:type="dxa"/>
-              <w:bottom w:w="120" w:type="dxa"/>
-              <w:left w:w="150" w:type="dxa"/>
-              <w:right w:w="150" w:type="dxa"/>
+              <w:top w:w="100" w:type="dxa"/>
+              <w:bottom w:w="100" w:type="dxa"/>
+              <w:left w:w="130" w:type="dxa"/>
+              <w:right w:w="130" w:type="dxa"/>
             </w:tcMar>
             <w:shd w:fill="FFFFFF"/>
           </w:tcPr>
           <w:p>
             <w:r>
               <w:rPr>
-                <w:rFonts w:ascii="Sarabun" w:hAnsi="Sarabun"/>
+                <w:rFonts w:ascii="TH Sarabun New" w:hAnsi="TH Sarabun New"/>
+                <w:b w:val="0"/>
+                <w:i w:val="0"/>
                 <w:color w:val="1E293B"/>
-                <w:sz w:val="19"/>
+                <w:sz w:val="27"/>
+                <w:rFonts w:ascii="TH Sarabun New" w:hAnsi="TH Sarabun New" w:cs="TH Sarabun New"/>
               </w:rPr>
               <w:t>เขียน query สร้างและตรวจสอบผลกับข้อมูล</w:t>
             </w:r>
@@ -1234,19 +1399,22 @@
           <w:tcPr>
             <w:tcW w:type="dxa" w:w="2340"/>
             <w:tcMar>
-              <w:top w:w="120" w:type="dxa"/>
-              <w:bottom w:w="120" w:type="dxa"/>
-              <w:left w:w="150" w:type="dxa"/>
-              <w:right w:w="150" w:type="dxa"/>
+              <w:top w:w="100" w:type="dxa"/>
+              <w:bottom w:w="100" w:type="dxa"/>
+              <w:left w:w="130" w:type="dxa"/>
+              <w:right w:w="130" w:type="dxa"/>
             </w:tcMar>
             <w:shd w:fill="FFFFFF"/>
           </w:tcPr>
           <w:p>
             <w:r>
               <w:rPr>
-                <w:rFonts w:ascii="Sarabun" w:hAnsi="Sarabun"/>
+                <w:rFonts w:ascii="TH Sarabun New" w:hAnsi="TH Sarabun New"/>
+                <w:b w:val="0"/>
+                <w:i w:val="0"/>
                 <w:color w:val="1E293B"/>
-                <w:sz w:val="19"/>
+                <w:sz w:val="27"/>
+                <w:rFonts w:ascii="TH Sarabun New" w:hAnsi="TH Sarabun New" w:cs="TH Sarabun New"/>
               </w:rPr>
               <w:t>เขียน SQL รายงาน 4 มิติ และตรวจสอบความถูกต้องกับข้อมูลจริง พร้อมแสดงผลบน Admin Dashboard และส่งออก CSV</w:t>
             </w:r>
@@ -1256,19 +1424,22 @@
           <w:tcPr>
             <w:tcW w:type="dxa" w:w="2340"/>
             <w:tcMar>
-              <w:top w:w="120" w:type="dxa"/>
-              <w:bottom w:w="120" w:type="dxa"/>
-              <w:left w:w="150" w:type="dxa"/>
-              <w:right w:w="150" w:type="dxa"/>
+              <w:top w:w="100" w:type="dxa"/>
+              <w:bottom w:w="100" w:type="dxa"/>
+              <w:left w:w="130" w:type="dxa"/>
+              <w:right w:w="130" w:type="dxa"/>
             </w:tcMar>
             <w:shd w:fill="FFFFFF"/>
           </w:tcPr>
           <w:p>
             <w:r>
               <w:rPr>
-                <w:rFonts w:ascii="Sarabun" w:hAnsi="Sarabun"/>
+                <w:rFonts w:ascii="TH Sarabun New" w:hAnsi="TH Sarabun New"/>
+                <w:b w:val="0"/>
+                <w:i w:val="0"/>
                 <w:color w:val="1E293B"/>
-                <w:sz w:val="19"/>
+                <w:sz w:val="27"/>
+                <w:rFonts w:ascii="TH Sarabun New" w:hAnsi="TH Sarabun New" w:cs="TH Sarabun New"/>
               </w:rPr>
               <w:t>สคริปต์ SQL [database/reports.sql](file:///c:/Users/next5/Desktop/EBOOK/database/reports.sql) และเล่มวิเคราะห์ [05_ANALYTICS_REPORTS.md](file:///c:/Users/next5/Desktop/EBOOK/docs/05_ANALYTICS_REPORTS.md)</w:t>
             </w:r>
@@ -1280,19 +1451,22 @@
           <w:tcPr>
             <w:tcW w:type="dxa" w:w="2340"/>
             <w:tcMar>
-              <w:top w:w="120" w:type="dxa"/>
-              <w:bottom w:w="120" w:type="dxa"/>
-              <w:left w:w="150" w:type="dxa"/>
-              <w:right w:w="150" w:type="dxa"/>
+              <w:top w:w="100" w:type="dxa"/>
+              <w:bottom w:w="100" w:type="dxa"/>
+              <w:left w:w="130" w:type="dxa"/>
+              <w:right w:w="130" w:type="dxa"/>
             </w:tcMar>
             <w:shd w:fill="F8FAFC"/>
           </w:tcPr>
           <w:p>
             <w:r>
               <w:rPr>
-                <w:rFonts w:ascii="Sarabun" w:hAnsi="Sarabun"/>
+                <w:rFonts w:ascii="TH Sarabun New" w:hAnsi="TH Sarabun New"/>
+                <w:b w:val="0"/>
+                <w:i w:val="0"/>
                 <w:color w:val="1E293B"/>
-                <w:sz w:val="19"/>
+                <w:sz w:val="27"/>
+                <w:rFonts w:ascii="TH Sarabun New" w:hAnsi="TH Sarabun New" w:cs="TH Sarabun New"/>
               </w:rPr>
               <w:t>**5 ทำรายงาน**</w:t>
             </w:r>
@@ -1302,19 +1476,22 @@
           <w:tcPr>
             <w:tcW w:type="dxa" w:w="2340"/>
             <w:tcMar>
-              <w:top w:w="120" w:type="dxa"/>
-              <w:bottom w:w="120" w:type="dxa"/>
-              <w:left w:w="150" w:type="dxa"/>
-              <w:right w:w="150" w:type="dxa"/>
+              <w:top w:w="100" w:type="dxa"/>
+              <w:bottom w:w="100" w:type="dxa"/>
+              <w:left w:w="130" w:type="dxa"/>
+              <w:right w:w="130" w:type="dxa"/>
             </w:tcMar>
             <w:shd w:fill="F8FAFC"/>
           </w:tcPr>
           <w:p>
             <w:r>
               <w:rPr>
-                <w:rFonts w:ascii="Sarabun" w:hAnsi="Sarabun"/>
+                <w:rFonts w:ascii="TH Sarabun New" w:hAnsi="TH Sarabun New"/>
+                <w:b w:val="0"/>
+                <w:i w:val="0"/>
                 <w:color w:val="1E293B"/>
-                <w:sz w:val="19"/>
+                <w:sz w:val="27"/>
+                <w:rFonts w:ascii="TH Sarabun New" w:hAnsi="TH Sarabun New" w:cs="TH Sarabun New"/>
               </w:rPr>
               <w:t>จัดทำเอกสารรูปเล่ม รายงาน</w:t>
             </w:r>
@@ -1324,19 +1501,22 @@
           <w:tcPr>
             <w:tcW w:type="dxa" w:w="2340"/>
             <w:tcMar>
-              <w:top w:w="120" w:type="dxa"/>
-              <w:bottom w:w="120" w:type="dxa"/>
-              <w:left w:w="150" w:type="dxa"/>
-              <w:right w:w="150" w:type="dxa"/>
+              <w:top w:w="100" w:type="dxa"/>
+              <w:bottom w:w="100" w:type="dxa"/>
+              <w:left w:w="130" w:type="dxa"/>
+              <w:right w:w="130" w:type="dxa"/>
             </w:tcMar>
             <w:shd w:fill="F8FAFC"/>
           </w:tcPr>
           <w:p>
             <w:r>
               <w:rPr>
-                <w:rFonts w:ascii="Sarabun" w:hAnsi="Sarabun"/>
+                <w:rFonts w:ascii="TH Sarabun New" w:hAnsi="TH Sarabun New"/>
+                <w:b w:val="0"/>
+                <w:i w:val="0"/>
                 <w:color w:val="1E293B"/>
-                <w:sz w:val="19"/>
+                <w:sz w:val="27"/>
+                <w:rFonts w:ascii="TH Sarabun New" w:hAnsi="TH Sarabun New" w:cs="TH Sarabun New"/>
               </w:rPr>
               <w:t>จัดทำเล่มรายงานฉบับสมบูรณ์ (Master Project Report) รวบรวมครบถ้วนทั้ง 6 บท พร้อมเอกสารสนับสนุนทุกด้าน</w:t>
             </w:r>
@@ -1346,19 +1526,22 @@
           <w:tcPr>
             <w:tcW w:type="dxa" w:w="2340"/>
             <w:tcMar>
-              <w:top w:w="120" w:type="dxa"/>
-              <w:bottom w:w="120" w:type="dxa"/>
-              <w:left w:w="150" w:type="dxa"/>
-              <w:right w:w="150" w:type="dxa"/>
+              <w:top w:w="100" w:type="dxa"/>
+              <w:bottom w:w="100" w:type="dxa"/>
+              <w:left w:w="130" w:type="dxa"/>
+              <w:right w:w="130" w:type="dxa"/>
             </w:tcMar>
             <w:shd w:fill="F8FAFC"/>
           </w:tcPr>
           <w:p>
             <w:r>
               <w:rPr>
-                <w:rFonts w:ascii="Sarabun" w:hAnsi="Sarabun"/>
+                <w:rFonts w:ascii="TH Sarabun New" w:hAnsi="TH Sarabun New"/>
+                <w:b w:val="0"/>
+                <w:i w:val="0"/>
                 <w:color w:val="1E293B"/>
-                <w:sz w:val="19"/>
+                <w:sz w:val="27"/>
+                <w:rFonts w:ascii="TH Sarabun New" w:hAnsi="TH Sarabun New" w:cs="TH Sarabun New"/>
               </w:rPr>
               <w:t>เล่มรายงานฉบับสมบูรณ์ [docs/FINAL_PROJECT_REPORT.md](file:///c:/Users/next5/Desktop/EBOOK/docs/FINAL_PROJECT_REPORT.md)</w:t>
             </w:r>
@@ -1370,19 +1553,22 @@
           <w:tcPr>
             <w:tcW w:type="dxa" w:w="2340"/>
             <w:tcMar>
-              <w:top w:w="120" w:type="dxa"/>
-              <w:bottom w:w="120" w:type="dxa"/>
-              <w:left w:w="150" w:type="dxa"/>
-              <w:right w:w="150" w:type="dxa"/>
+              <w:top w:w="100" w:type="dxa"/>
+              <w:bottom w:w="100" w:type="dxa"/>
+              <w:left w:w="130" w:type="dxa"/>
+              <w:right w:w="130" w:type="dxa"/>
             </w:tcMar>
             <w:shd w:fill="FFFFFF"/>
           </w:tcPr>
           <w:p>
             <w:r>
               <w:rPr>
-                <w:rFonts w:ascii="Sarabun" w:hAnsi="Sarabun"/>
+                <w:rFonts w:ascii="TH Sarabun New" w:hAnsi="TH Sarabun New"/>
+                <w:b w:val="0"/>
+                <w:i w:val="0"/>
                 <w:color w:val="1E293B"/>
-                <w:sz w:val="19"/>
+                <w:sz w:val="27"/>
+                <w:rFonts w:ascii="TH Sarabun New" w:hAnsi="TH Sarabun New" w:cs="TH Sarabun New"/>
               </w:rPr>
               <w:t>**6 นำเสนอ**</w:t>
             </w:r>
@@ -1392,19 +1578,22 @@
           <w:tcPr>
             <w:tcW w:type="dxa" w:w="2340"/>
             <w:tcMar>
-              <w:top w:w="120" w:type="dxa"/>
-              <w:bottom w:w="120" w:type="dxa"/>
-              <w:left w:w="150" w:type="dxa"/>
-              <w:right w:w="150" w:type="dxa"/>
+              <w:top w:w="100" w:type="dxa"/>
+              <w:bottom w:w="100" w:type="dxa"/>
+              <w:left w:w="130" w:type="dxa"/>
+              <w:right w:w="130" w:type="dxa"/>
             </w:tcMar>
             <w:shd w:fill="FFFFFF"/>
           </w:tcPr>
           <w:p>
             <w:r>
               <w:rPr>
-                <w:rFonts w:ascii="Sarabun" w:hAnsi="Sarabun"/>
+                <w:rFonts w:ascii="TH Sarabun New" w:hAnsi="TH Sarabun New"/>
+                <w:b w:val="0"/>
+                <w:i w:val="0"/>
                 <w:color w:val="1E293B"/>
-                <w:sz w:val="19"/>
+                <w:sz w:val="27"/>
+                <w:rFonts w:ascii="TH Sarabun New" w:hAnsi="TH Sarabun New" w:cs="TH Sarabun New"/>
               </w:rPr>
               <w:t>ทดสอบ flow แก้ข้อผิดพลาด สาธิต และจัดชุดส่งงาน</w:t>
             </w:r>
@@ -1414,19 +1603,22 @@
           <w:tcPr>
             <w:tcW w:type="dxa" w:w="2340"/>
             <w:tcMar>
-              <w:top w:w="120" w:type="dxa"/>
-              <w:bottom w:w="120" w:type="dxa"/>
-              <w:left w:w="150" w:type="dxa"/>
-              <w:right w:w="150" w:type="dxa"/>
+              <w:top w:w="100" w:type="dxa"/>
+              <w:bottom w:w="100" w:type="dxa"/>
+              <w:left w:w="130" w:type="dxa"/>
+              <w:right w:w="130" w:type="dxa"/>
             </w:tcMar>
             <w:shd w:fill="FFFFFF"/>
           </w:tcPr>
           <w:p>
             <w:r>
               <w:rPr>
-                <w:rFonts w:ascii="Sarabun" w:hAnsi="Sarabun"/>
+                <w:rFonts w:ascii="TH Sarabun New" w:hAnsi="TH Sarabun New"/>
+                <w:b w:val="0"/>
+                <w:i w:val="0"/>
                 <w:color w:val="1E293B"/>
-                <w:sz w:val="19"/>
+                <w:sz w:val="27"/>
+                <w:rFonts w:ascii="TH Sarabun New" w:hAnsi="TH Sarabun New" w:cs="TH Sarabun New"/>
               </w:rPr>
               <w:t>พัฒนาชุดทดสอบอัตโนมัติ 10 กรณี (`npm test` ผ่าน 100%), จัดทำสคริปต์สาธิต 5 นาที และเตรียมชุดไฟล์ส่งงาน</w:t>
             </w:r>
@@ -1436,19 +1628,22 @@
           <w:tcPr>
             <w:tcW w:type="dxa" w:w="2340"/>
             <w:tcMar>
-              <w:top w:w="120" w:type="dxa"/>
-              <w:bottom w:w="120" w:type="dxa"/>
-              <w:left w:w="150" w:type="dxa"/>
-              <w:right w:w="150" w:type="dxa"/>
+              <w:top w:w="100" w:type="dxa"/>
+              <w:bottom w:w="100" w:type="dxa"/>
+              <w:left w:w="130" w:type="dxa"/>
+              <w:right w:w="130" w:type="dxa"/>
             </w:tcMar>
             <w:shd w:fill="FFFFFF"/>
           </w:tcPr>
           <w:p>
             <w:r>
               <w:rPr>
-                <w:rFonts w:ascii="Sarabun" w:hAnsi="Sarabun"/>
+                <w:rFonts w:ascii="TH Sarabun New" w:hAnsi="TH Sarabun New"/>
+                <w:b w:val="0"/>
+                <w:i w:val="0"/>
                 <w:color w:val="1E293B"/>
-                <w:sz w:val="19"/>
+                <w:sz w:val="27"/>
+                <w:rFonts w:ascii="TH Sarabun New" w:hAnsi="TH Sarabun New" w:cs="TH Sarabun New"/>
               </w:rPr>
               <w:t>ตารางทดสอบ [04_TEST_CASES.md](file:///c:/Users/next5/Desktop/EBOOK/docs/04_TEST_CASES.md), สคริปต์สาธิตใน Master Report และ [README.md](file:///c:/Users/next5/Desktop/EBOOK/README.md)</w:t>
             </w:r>
@@ -1458,17 +1653,17 @@
     </w:tbl>
     <w:p>
       <w:pPr>
-        <w:spacing w:after="120"/>
+        <w:spacing w:after="80"/>
       </w:pPr>
     </w:p>
     <w:p>
       <w:pPr>
-        <w:spacing w:before="120" w:after="120"/>
+        <w:spacing w:before="80" w:after="80"/>
       </w:pPr>
       <w:r>
         <w:rPr>
           <w:color w:val="CBD5E1"/>
-          <w:sz w:val="18"/>
+          <w:sz w:val="16"/>
         </w:rPr>
         <w:t>__________________________________________________________________________</w:t>
       </w:r>
@@ -1476,14 +1671,16 @@
     <w:p>
       <w:pPr>
         <w:pStyle w:val="Heading2"/>
-        <w:spacing w:before="240" w:after="120"/>
+        <w:spacing w:before="240" w:after="80"/>
       </w:pPr>
       <w:r>
         <w:rPr>
-          <w:rFonts w:ascii="Sarabun" w:hAnsi="Sarabun"/>
+          <w:rFonts w:ascii="TH Sarabun New" w:hAnsi="TH Sarabun New"/>
           <w:b/>
+          <w:i w:val="0"/>
           <w:color w:val="1E3A8A"/>
-          <w:sz w:val="28"/>
+          <w:sz w:val="36"/>
+          <w:rFonts w:ascii="TH Sarabun New" w:hAnsi="TH Sarabun New" w:cs="TH Sarabun New"/>
         </w:rPr>
         <w:t>รายการเอกสารที่จัดทำครบถ้วนตามเกณฑ์</w:t>
       </w:r>
@@ -1491,13 +1688,16 @@
     <w:p>
       <w:pPr>
         <w:pStyle w:val="ListNumber"/>
-        <w:spacing w:after="60"/>
+        <w:spacing w:after="40"/>
       </w:pPr>
       <w:r>
         <w:rPr>
-          <w:rFonts w:ascii="Sarabun" w:hAnsi="Sarabun"/>
+          <w:rFonts w:ascii="TH Sarabun New" w:hAnsi="TH Sarabun New"/>
+          <w:b w:val="0"/>
+          <w:i w:val="0"/>
           <w:color w:val="1E293B"/>
-          <w:sz w:val="21"/>
+          <w:sz w:val="32"/>
+          <w:rFonts w:ascii="TH Sarabun New" w:hAnsi="TH Sarabun New" w:cs="TH Sarabun New"/>
         </w:rPr>
         <w:t>[00_PROJECT_INFO.md](file:///c:/Users/next5/Desktop/EBOOK/docs/00_PROJECT_INFO.md) - ข้อมูลกลุ่ม โครงงาน การแบ่งหน้าที่ และขั้นตอนดำเนินงาน 6 ระยะ</w:t>
       </w:r>
@@ -1505,13 +1705,16 @@
     <w:p>
       <w:pPr>
         <w:pStyle w:val="ListNumber"/>
-        <w:spacing w:after="60"/>
+        <w:spacing w:after="40"/>
       </w:pPr>
       <w:r>
         <w:rPr>
-          <w:rFonts w:ascii="Sarabun" w:hAnsi="Sarabun"/>
+          <w:rFonts w:ascii="TH Sarabun New" w:hAnsi="TH Sarabun New"/>
+          <w:b w:val="0"/>
+          <w:i w:val="0"/>
           <w:color w:val="1E293B"/>
-          <w:sz w:val="21"/>
+          <w:sz w:val="32"/>
+          <w:rFonts w:ascii="TH Sarabun New" w:hAnsi="TH Sarabun New" w:cs="TH Sarabun New"/>
         </w:rPr>
         <w:t>[01_DATABASE_DESIGN_ERD.md](file:///c:/Users/next5/Desktop/EBOOK/docs/01_DATABASE_DESIGN_ERD.md) - แผนภาพ ERD, Data Dictionary ทั้ง 11 ตาราง, และคำอธิบาย 3NF</w:t>
       </w:r>
@@ -1519,13 +1722,16 @@
     <w:p>
       <w:pPr>
         <w:pStyle w:val="ListNumber"/>
-        <w:spacing w:after="60"/>
+        <w:spacing w:after="40"/>
       </w:pPr>
       <w:r>
         <w:rPr>
-          <w:rFonts w:ascii="Sarabun" w:hAnsi="Sarabun"/>
+          <w:rFonts w:ascii="TH Sarabun New" w:hAnsi="TH Sarabun New"/>
+          <w:b w:val="0"/>
+          <w:i w:val="0"/>
           <w:color w:val="1E293B"/>
-          <w:sz w:val="21"/>
+          <w:sz w:val="32"/>
+          <w:rFonts w:ascii="TH Sarabun New" w:hAnsi="TH Sarabun New" w:cs="TH Sarabun New"/>
         </w:rPr>
         <w:t>[02_AI_USAGE_LOG.md](file:///c:/Users/next5/Desktop/EBOOK/docs/02_AI_USAGE_LOG.md) - บันทึกการใช้งาน AI อย่างรับผิดชอบ 13 ลำดับตามเกณฑ์ใบงาน</w:t>
       </w:r>
@@ -1533,13 +1739,16 @@
     <w:p>
       <w:pPr>
         <w:pStyle w:val="ListNumber"/>
-        <w:spacing w:after="60"/>
+        <w:spacing w:after="40"/>
       </w:pPr>
       <w:r>
         <w:rPr>
-          <w:rFonts w:ascii="Sarabun" w:hAnsi="Sarabun"/>
+          <w:rFonts w:ascii="TH Sarabun New" w:hAnsi="TH Sarabun New"/>
+          <w:b w:val="0"/>
+          <w:i w:val="0"/>
           <w:color w:val="1E293B"/>
-          <w:sz w:val="21"/>
+          <w:sz w:val="32"/>
+          <w:rFonts w:ascii="TH Sarabun New" w:hAnsi="TH Sarabun New" w:cs="TH Sarabun New"/>
         </w:rPr>
         <w:t>[03_SYSTEM_FLOW_AND_SCENARIOS.md](file:///c:/Users/next5/Desktop/EBOOK/docs/03_SYSTEM_FLOW_AND_SCENARIOS.md) - แผนผังลำดับการทำงาน (Sequence Diagram) และกฎความปลอดภัยดาวน์โหลด</w:t>
       </w:r>
@@ -1547,13 +1756,16 @@
     <w:p>
       <w:pPr>
         <w:pStyle w:val="ListNumber"/>
-        <w:spacing w:after="60"/>
+        <w:spacing w:after="40"/>
       </w:pPr>
       <w:r>
         <w:rPr>
-          <w:rFonts w:ascii="Sarabun" w:hAnsi="Sarabun"/>
+          <w:rFonts w:ascii="TH Sarabun New" w:hAnsi="TH Sarabun New"/>
+          <w:b w:val="0"/>
+          <w:i w:val="0"/>
           <w:color w:val="1E293B"/>
-          <w:sz w:val="21"/>
+          <w:sz w:val="32"/>
+          <w:rFonts w:ascii="TH Sarabun New" w:hAnsi="TH Sarabun New" w:cs="TH Sarabun New"/>
         </w:rPr>
         <w:t>[04_TEST_CASES.md](file:///c:/Users/next5/Desktop/EBOOK/docs/04_TEST_CASES.md) - ตารางและผลการทดสอบระบบ 10 กรณี (ครอบคลุมทั้ง Happy Path และ Data Constraints)</w:t>
       </w:r>
@@ -1561,13 +1773,16 @@
     <w:p>
       <w:pPr>
         <w:pStyle w:val="ListNumber"/>
-        <w:spacing w:after="60"/>
+        <w:spacing w:after="40"/>
       </w:pPr>
       <w:r>
         <w:rPr>
-          <w:rFonts w:ascii="Sarabun" w:hAnsi="Sarabun"/>
+          <w:rFonts w:ascii="TH Sarabun New" w:hAnsi="TH Sarabun New"/>
+          <w:b w:val="0"/>
+          <w:i w:val="0"/>
           <w:color w:val="1E293B"/>
-          <w:sz w:val="21"/>
+          <w:sz w:val="32"/>
+          <w:rFonts w:ascii="TH Sarabun New" w:hAnsi="TH Sarabun New" w:cs="TH Sarabun New"/>
         </w:rPr>
         <w:t>[05_ANALYTICS_REPORTS.md](file:///c:/Users/next5/Desktop/EBOOK/docs/05_ANALYTICS_REPORTS.md) - รายละเอียดคำสั่ง SQL, ผลลัพธ์ข้อมูลจริง, และบทวิเคราะห์ 4 รายงาน</w:t>
       </w:r>
@@ -1575,13 +1790,16 @@
     <w:p>
       <w:pPr>
         <w:pStyle w:val="ListNumber"/>
-        <w:spacing w:after="60"/>
+        <w:spacing w:after="40"/>
       </w:pPr>
       <w:r>
         <w:rPr>
-          <w:rFonts w:ascii="Sarabun" w:hAnsi="Sarabun"/>
+          <w:rFonts w:ascii="TH Sarabun New" w:hAnsi="TH Sarabun New"/>
+          <w:b w:val="0"/>
+          <w:i w:val="0"/>
           <w:color w:val="1E293B"/>
-          <w:sz w:val="21"/>
+          <w:sz w:val="32"/>
+          <w:rFonts w:ascii="TH Sarabun New" w:hAnsi="TH Sarabun New" w:cs="TH Sarabun New"/>
         </w:rPr>
         <w:t>[FINAL_PROJECT_REPORT.md](file:///c:/Users/next5/Desktop/EBOOK/docs/FINAL_PROJECT_REPORT.md) - เล่มรายงานฉบับสมบูรณ์ (Master Report) และสคริปต์การนำเสนอ 5 นาที</w:t>
       </w:r>

</xml_diff>

<commit_message>
Fix checkout default to no-slip, support cancel order demo, and update docs
</commit_message>
<xml_diff>
--- a/docs/00_PROJECT_INFO.docx
+++ b/docs/00_PROJECT_INFO.docx
@@ -181,7 +181,7 @@
           <w:sz w:val="32"/>
           <w:rFonts w:ascii="TH Sarabun New" w:hAnsi="TH Sarabun New" w:cs="TH Sarabun New"/>
         </w:rPr>
-        <w:t>Database Management System (DBMS): SQLite (ผ่านไดรเวอร์ `better-sqlite3` รองรับ ACID, Constraints, Foreign Keys และไฟล์ `.sql` มาตรฐาน)</w:t>
+        <w:t>Database Management System (DBMS): Supabase (Cloud PostgreSQL) และ SQLite (Local Embedded Cache) รองรับมาตรฐาน ACID, Constraints, Foreign Keys และ Realtime Cloud Data Synchronization</w:t>
       </w:r>
     </w:p>
     <w:p>
@@ -262,16 +262,14 @@
         </w:tblBorders>
       </w:tblPr>
       <w:tblGrid>
-        <w:gridCol w:w="1872"/>
-        <w:gridCol w:w="1872"/>
-        <w:gridCol w:w="1872"/>
-        <w:gridCol w:w="1872"/>
-        <w:gridCol w:w="1872"/>
+        <w:gridCol w:w="3120"/>
+        <w:gridCol w:w="3120"/>
+        <w:gridCol w:w="3120"/>
       </w:tblGrid>
       <w:tr>
         <w:tc>
           <w:tcPr>
-            <w:tcW w:type="dxa" w:w="1872"/>
+            <w:tcW w:type="dxa" w:w="3120"/>
             <w:tcMar>
               <w:top w:w="100" w:type="dxa"/>
               <w:bottom w:w="100" w:type="dxa"/>
@@ -296,7 +294,7 @@
         </w:tc>
         <w:tc>
           <w:tcPr>
-            <w:tcW w:type="dxa" w:w="1872"/>
+            <w:tcW w:type="dxa" w:w="3120"/>
             <w:tcMar>
               <w:top w:w="100" w:type="dxa"/>
               <w:bottom w:w="100" w:type="dxa"/>
@@ -321,7 +319,7 @@
         </w:tc>
         <w:tc>
           <w:tcPr>
-            <w:tcW w:type="dxa" w:w="1872"/>
+            <w:tcW w:type="dxa" w:w="3120"/>
             <w:tcMar>
               <w:top w:w="100" w:type="dxa"/>
               <w:bottom w:w="100" w:type="dxa"/>
@@ -340,57 +338,7 @@
                 <w:sz w:val="28"/>
                 <w:rFonts w:ascii="TH Sarabun New" w:hAnsi="TH Sarabun New" w:cs="TH Sarabun New"/>
               </w:rPr>
-              <w:t>ตารางที่รับผิดชอบ</w:t>
-            </w:r>
-          </w:p>
-        </w:tc>
-        <w:tc>
-          <w:tcPr>
-            <w:tcW w:type="dxa" w:w="1872"/>
-            <w:tcMar>
-              <w:top w:w="100" w:type="dxa"/>
-              <w:bottom w:w="100" w:type="dxa"/>
-              <w:left w:w="130" w:type="dxa"/>
-              <w:right w:w="130" w:type="dxa"/>
-            </w:tcMar>
-            <w:shd w:fill="1E3A8A"/>
-          </w:tcPr>
-          <w:p>
-            <w:r>
-              <w:rPr>
-                <w:rFonts w:ascii="TH Sarabun New" w:hAnsi="TH Sarabun New"/>
-                <w:b/>
-                <w:i w:val="0"/>
-                <w:color w:val="FFFFFF"/>
-                <w:sz w:val="28"/>
-                <w:rFonts w:ascii="TH Sarabun New" w:hAnsi="TH Sarabun New" w:cs="TH Sarabun New"/>
-              </w:rPr>
-              <w:t>Query รายงานที่ต้องอธิบาย</w:t>
-            </w:r>
-          </w:p>
-        </w:tc>
-        <w:tc>
-          <w:tcPr>
-            <w:tcW w:type="dxa" w:w="1872"/>
-            <w:tcMar>
-              <w:top w:w="100" w:type="dxa"/>
-              <w:bottom w:w="100" w:type="dxa"/>
-              <w:left w:w="130" w:type="dxa"/>
-              <w:right w:w="130" w:type="dxa"/>
-            </w:tcMar>
-            <w:shd w:fill="1E3A8A"/>
-          </w:tcPr>
-          <w:p>
-            <w:r>
-              <w:rPr>
-                <w:rFonts w:ascii="TH Sarabun New" w:hAnsi="TH Sarabun New"/>
-                <w:b/>
-                <w:i w:val="0"/>
-                <w:color w:val="FFFFFF"/>
-                <w:sz w:val="28"/>
-                <w:rFonts w:ascii="TH Sarabun New" w:hAnsi="TH Sarabun New" w:cs="TH Sarabun New"/>
-              </w:rPr>
-              <w:t>เส้นทางหลักของระบบที่รับผิดชอบ</w:t>
+              <w:t>ส่วนที่ต้องอธิบายในการนำเสนอ</w:t>
             </w:r>
           </w:p>
         </w:tc>
@@ -398,7 +346,7 @@
       <w:tr>
         <w:tc>
           <w:tcPr>
-            <w:tcW w:type="dxa" w:w="1872"/>
+            <w:tcW w:type="dxa" w:w="3120"/>
             <w:tcMar>
               <w:top w:w="100" w:type="dxa"/>
               <w:bottom w:w="100" w:type="dxa"/>
@@ -417,13 +365,13 @@
                 <w:sz w:val="27"/>
                 <w:rFonts w:ascii="TH Sarabun New" w:hAnsi="TH Sarabun New" w:cs="TH Sarabun New"/>
               </w:rPr>
-              <w:t>**1. นายธนวัฒน์ นามเหง้า** (67332110293-4)</w:t>
+              <w:t>**1. นายธนวัฒน์ นามเหง้า**&lt;br&gt;(67332110293-4)</w:t>
             </w:r>
           </w:p>
         </w:tc>
         <w:tc>
           <w:tcPr>
-            <w:tcW w:type="dxa" w:w="1872"/>
+            <w:tcW w:type="dxa" w:w="3120"/>
             <w:tcMar>
               <w:top w:w="100" w:type="dxa"/>
               <w:bottom w:w="100" w:type="dxa"/>
@@ -442,13 +390,13 @@
                 <w:sz w:val="27"/>
                 <w:rFonts w:ascii="TH Sarabun New" w:hAnsi="TH Sarabun New" w:cs="TH Sarabun New"/>
               </w:rPr>
-              <w:t>ผู้ออกแบบแค็ตตาล็อกสินค้า, ตะกร้าสินค้า และระบบแจกจ่ายไฟล์ดาวน์โหลดที่ปลอดภัย</w:t>
+              <w:t>**พัฒนาระบบจัดการข้อมูล (Database Developer)**&lt;br&gt;- ออกแบบ ERD และตาราง 3NF&lt;br&gt;- พัฒนาระบบ Cloud Sync (Supabase &amp; SQLite)&lt;br&gt;- พัฒนาระบบแค็ตตาล็อกและตะกร้าสินค้า</w:t>
             </w:r>
           </w:p>
         </w:tc>
         <w:tc>
           <w:tcPr>
-            <w:tcW w:type="dxa" w:w="1872"/>
+            <w:tcW w:type="dxa" w:w="3120"/>
             <w:tcMar>
               <w:top w:w="100" w:type="dxa"/>
               <w:bottom w:w="100" w:type="dxa"/>
@@ -467,57 +415,7 @@
                 <w:sz w:val="27"/>
                 <w:rFonts w:ascii="TH Sarabun New" w:hAnsi="TH Sarabun New" w:cs="TH Sarabun New"/>
               </w:rPr>
-              <w:t>`ebooks`, `categories`, `authors`, `carts`, `cart_items`, `download_links`</w:t>
-            </w:r>
-          </w:p>
-        </w:tc>
-        <w:tc>
-          <w:tcPr>
-            <w:tcW w:type="dxa" w:w="1872"/>
-            <w:tcMar>
-              <w:top w:w="100" w:type="dxa"/>
-              <w:bottom w:w="100" w:type="dxa"/>
-              <w:left w:w="130" w:type="dxa"/>
-              <w:right w:w="130" w:type="dxa"/>
-            </w:tcMar>
-            <w:shd w:fill="F8FAFC"/>
-          </w:tcPr>
-          <w:p>
-            <w:r>
-              <w:rPr>
-                <w:rFonts w:ascii="TH Sarabun New" w:hAnsi="TH Sarabun New"/>
-                <w:b w:val="0"/>
-                <w:i w:val="0"/>
-                <w:color w:val="1E293B"/>
-                <w:sz w:val="27"/>
-                <w:rFonts w:ascii="TH Sarabun New" w:hAnsi="TH Sarabun New" w:cs="TH Sarabun New"/>
-              </w:rPr>
-              <w:t>**รายงานที่ 2:** E-Book ขายดีตามยอดขายและจำนวนเล่ม&lt;br&gt;**รายงานที่ 3:** ยอดขายตามหมวดหมู่สินค้า</w:t>
-            </w:r>
-          </w:p>
-        </w:tc>
-        <w:tc>
-          <w:tcPr>
-            <w:tcW w:type="dxa" w:w="1872"/>
-            <w:tcMar>
-              <w:top w:w="100" w:type="dxa"/>
-              <w:bottom w:w="100" w:type="dxa"/>
-              <w:left w:w="130" w:type="dxa"/>
-              <w:right w:w="130" w:type="dxa"/>
-            </w:tcMar>
-            <w:shd w:fill="F8FAFC"/>
-          </w:tcPr>
-          <w:p>
-            <w:r>
-              <w:rPr>
-                <w:rFonts w:ascii="TH Sarabun New" w:hAnsi="TH Sarabun New"/>
-                <w:b w:val="0"/>
-                <w:i w:val="0"/>
-                <w:color w:val="1E293B"/>
-                <w:sz w:val="27"/>
-                <w:rFonts w:ascii="TH Sarabun New" w:hAnsi="TH Sarabun New" w:cs="TH Sarabun New"/>
-              </w:rPr>
-              <w:t>หน้าร้าน (Storefront): ค้นหา/กรองหนังสือ, ตะกร้าสินค้า และเงื่อนไขการเข้าถึงลิงก์ดาวน์โหลดหลังได้รับยืนยัน</w:t>
+              <w:t>**1. โครงสร้างฐานข้อมูล (ERD 11 ตาราง &amp; 3NF):** ความสัมพันธ์ PK, FK และสคีมา&lt;br&gt;**2. ระบบจัดการข้อมูล (Supabase Cloud Sync):** การเก็บรักษาข้อมูลจริงบนคลาวด์&lt;br&gt;**3. SQL Query 2 รายการ:** ยอดขายตามชื่อหนังสือ (`SUM`, `COUNT`) และ Top 3 (`LIMIT 3`)&lt;br&gt;**4. เส้นทางการไหลของข้อมูล (Data Flow):** หนังสือ ➔ ตะกร้า ➔ ออเดอร์</w:t>
             </w:r>
           </w:p>
         </w:tc>
@@ -525,7 +423,7 @@
       <w:tr>
         <w:tc>
           <w:tcPr>
-            <w:tcW w:type="dxa" w:w="1872"/>
+            <w:tcW w:type="dxa" w:w="3120"/>
             <w:tcMar>
               <w:top w:w="100" w:type="dxa"/>
               <w:bottom w:w="100" w:type="dxa"/>
@@ -544,13 +442,13 @@
                 <w:sz w:val="27"/>
                 <w:rFonts w:ascii="TH Sarabun New" w:hAnsi="TH Sarabun New" w:cs="TH Sarabun New"/>
               </w:rPr>
-              <w:t>**2. นายภานุวัฒน์ แสงเครือ** (67332110248-5)</w:t>
+              <w:t>**2. นายภานุวัฒน์ แสงเครือ**&lt;br&gt;(67332110248-5)</w:t>
             </w:r>
           </w:p>
         </w:tc>
         <w:tc>
           <w:tcPr>
-            <w:tcW w:type="dxa" w:w="1872"/>
+            <w:tcW w:type="dxa" w:w="3120"/>
             <w:tcMar>
               <w:top w:w="100" w:type="dxa"/>
               <w:bottom w:w="100" w:type="dxa"/>
@@ -569,13 +467,13 @@
                 <w:sz w:val="27"/>
                 <w:rFonts w:ascii="TH Sarabun New" w:hAnsi="TH Sarabun New" w:cs="TH Sarabun New"/>
               </w:rPr>
-              <w:t>ผู้ออกแบบระบบสมาชิก, สิทธิ์เข้าถึง, ระบบคำสั่งซื้อ และระบบชำระเงินจำลอง</w:t>
+              <w:t>**ทดสอบระบบและระบุจุดบกพร่อง (QA Tester)**&lt;br&gt;- ทดสอบระบบ 10 กรณี (10 Test Cases)&lt;br&gt;- ตรวจสอบเงื่อนไข Database Constraints&lt;br&gt;- ระบุและติดตามการแก้ไขข้อผิดพลาดของระบบ</w:t>
             </w:r>
           </w:p>
         </w:tc>
         <w:tc>
           <w:tcPr>
-            <w:tcW w:type="dxa" w:w="1872"/>
+            <w:tcW w:type="dxa" w:w="3120"/>
             <w:tcMar>
               <w:top w:w="100" w:type="dxa"/>
               <w:bottom w:w="100" w:type="dxa"/>
@@ -594,57 +492,7 @@
                 <w:sz w:val="27"/>
                 <w:rFonts w:ascii="TH Sarabun New" w:hAnsi="TH Sarabun New" w:cs="TH Sarabun New"/>
               </w:rPr>
-              <w:t>`users`, `roles`, `orders`, `order_items`, `payments`</w:t>
-            </w:r>
-          </w:p>
-        </w:tc>
-        <w:tc>
-          <w:tcPr>
-            <w:tcW w:type="dxa" w:w="1872"/>
-            <w:tcMar>
-              <w:top w:w="100" w:type="dxa"/>
-              <w:bottom w:w="100" w:type="dxa"/>
-              <w:left w:w="130" w:type="dxa"/>
-              <w:right w:w="130" w:type="dxa"/>
-            </w:tcMar>
-            <w:shd w:fill="FFFFFF"/>
-          </w:tcPr>
-          <w:p>
-            <w:r>
-              <w:rPr>
-                <w:rFonts w:ascii="TH Sarabun New" w:hAnsi="TH Sarabun New"/>
-                <w:b w:val="0"/>
-                <w:i w:val="0"/>
-                <w:color w:val="1E293B"/>
-                <w:sz w:val="27"/>
-                <w:rFonts w:ascii="TH Sarabun New" w:hAnsi="TH Sarabun New" w:cs="TH Sarabun New"/>
-              </w:rPr>
-              <w:t>**รายงานที่ 1:** ยอดขายตามช่วงเวลา (วัน/เดือน)&lt;br&gt;**รายงานที่ 4:** ลูกค้าชั้นดีและสถิติสถานะคำสั่งซื้อ</w:t>
-            </w:r>
-          </w:p>
-        </w:tc>
-        <w:tc>
-          <w:tcPr>
-            <w:tcW w:type="dxa" w:w="1872"/>
-            <w:tcMar>
-              <w:top w:w="100" w:type="dxa"/>
-              <w:bottom w:w="100" w:type="dxa"/>
-              <w:left w:w="130" w:type="dxa"/>
-              <w:right w:w="130" w:type="dxa"/>
-            </w:tcMar>
-            <w:shd w:fill="FFFFFF"/>
-          </w:tcPr>
-          <w:p>
-            <w:r>
-              <w:rPr>
-                <w:rFonts w:ascii="TH Sarabun New" w:hAnsi="TH Sarabun New"/>
-                <w:b w:val="0"/>
-                <w:i w:val="0"/>
-                <w:color w:val="1E293B"/>
-                <w:sz w:val="27"/>
-                <w:rFonts w:ascii="TH Sarabun New" w:hAnsi="TH Sarabun New" w:cs="TH Sarabun New"/>
-              </w:rPr>
-              <w:t>หลังบ้าน (Admin): ระบบล็อกอินแยกสิทธิ์, ตรวจสอบหลักฐานสลิปจำลอง, อนุมัติคำสั่งซื้อ และสรุปยอดขาย</w:t>
+              <w:t>**1. ผลการทดสอบ 10 Test Cases:** การดักข้อมูลซ้ำ (UNIQUE), ราคาติดลบ (CHECK), และการแก้ไขสลิปยอดไม่ตรง&lt;br&gt;**2. ความปลอดภัย (RBAC):** ล็อกสิทธิ์ดาวน์โหลด (403 Gate) และแยกสิทธิ์ Admin/User&lt;br&gt;**3. SQL Query 2 รายการ:** ยอดขายตามช่องทางชำระเงิน (`AVG`) และลูกค้าประจำ (`HAVING`)&lt;br&gt;**4. เส้นทางการสั่งซื้อ (Order Flow):** สั่งซื้อแนบสลิป ➔ แอดมินอนุมัติ ➔ โหลด E-Book</w:t>
             </w:r>
           </w:p>
         </w:tc>

</xml_diff>